<commit_message>
modfiications css, comportement du workflow amélioré, guide user mis a jour, sécurité mdp amélioré
</commit_message>
<xml_diff>
--- a/public/GuideUtilisateurGDAP.docx
+++ b/public/GuideUtilisateurGDAP.docx
@@ -5,7 +5,12 @@
     <w:sdt>
       <w:sdtPr>
         <w:rPr>
+          <w:rFonts w:eastAsiaTheme="minorHAnsi"/>
+          <w:kern w:val="2"/>
           <w:sz w:val="2"/>
+          <w:szCs w:val="24"/>
+          <w:lang w:eastAsia="en-US"/>
+          <w14:ligatures w14:val="standardContextual"/>
         </w:rPr>
         <w:id w:val="-1566636986"/>
         <w:docPartObj>
@@ -15,12 +20,7 @@
       </w:sdtPr>
       <w:sdtEndPr>
         <w:rPr>
-          <w:rFonts w:eastAsiaTheme="minorHAnsi"/>
-          <w:kern w:val="2"/>
           <w:sz w:val="24"/>
-          <w:szCs w:val="24"/>
-          <w:lang w:eastAsia="en-US"/>
-          <w14:ligatures w14:val="standardContextual"/>
         </w:rPr>
       </w:sdtEndPr>
       <w:sdtContent>
@@ -1058,6 +1058,15 @@
     </w:p>
     <w:sdt>
       <w:sdtPr>
+        <w:rPr>
+          <w:rFonts w:asciiTheme="minorHAnsi" w:eastAsiaTheme="minorHAnsi" w:hAnsiTheme="minorHAnsi" w:cstheme="minorBidi"/>
+          <w:color w:val="auto"/>
+          <w:kern w:val="2"/>
+          <w:sz w:val="24"/>
+          <w:szCs w:val="24"/>
+          <w:lang w:eastAsia="en-US"/>
+          <w14:ligatures w14:val="standardContextual"/>
+        </w:rPr>
         <w:id w:val="656191639"/>
         <w:docPartObj>
           <w:docPartGallery w:val="Table of Contents"/>
@@ -1066,15 +1075,8 @@
       </w:sdtPr>
       <w:sdtEndPr>
         <w:rPr>
-          <w:rFonts w:asciiTheme="minorHAnsi" w:eastAsiaTheme="minorHAnsi" w:hAnsiTheme="minorHAnsi" w:cstheme="minorBidi"/>
           <w:b/>
           <w:bCs/>
-          <w:color w:val="auto"/>
-          <w:kern w:val="2"/>
-          <w:sz w:val="24"/>
-          <w:szCs w:val="24"/>
-          <w:lang w:eastAsia="en-US"/>
-          <w14:ligatures w14:val="standardContextual"/>
         </w:rPr>
       </w:sdtEndPr>
       <w:sdtContent>
@@ -1107,7 +1109,7 @@
           <w:r>
             <w:fldChar w:fldCharType="separate"/>
           </w:r>
-          <w:hyperlink w:anchor="_Toc229057809" w:history="1">
+          <w:hyperlink w:anchor="_Toc229386147" w:history="1">
             <w:r>
               <w:rPr>
                 <w:rStyle w:val="Lienhypertexte"/>
@@ -1134,7 +1136,7 @@
                 <w:noProof/>
                 <w:webHidden/>
               </w:rPr>
-              <w:instrText xml:space="preserve"> PAGEREF _Toc229057809 \h </w:instrText>
+              <w:instrText xml:space="preserve"> PAGEREF _Toc229386147 \h </w:instrText>
             </w:r>
             <w:r>
               <w:rPr>
@@ -1177,7 +1179,7 @@
               <w:lang w:eastAsia="fr-FR"/>
             </w:rPr>
           </w:pPr>
-          <w:hyperlink w:anchor="_Toc229057810" w:history="1">
+          <w:hyperlink w:anchor="_Toc229386148" w:history="1">
             <w:r>
               <w:rPr>
                 <w:rStyle w:val="Lienhypertexte"/>
@@ -1204,7 +1206,7 @@
                 <w:noProof/>
                 <w:webHidden/>
               </w:rPr>
-              <w:instrText xml:space="preserve"> PAGEREF _Toc229057810 \h </w:instrText>
+              <w:instrText xml:space="preserve"> PAGEREF _Toc229386148 \h </w:instrText>
             </w:r>
             <w:r>
               <w:rPr>
@@ -1247,7 +1249,7 @@
               <w:lang w:eastAsia="fr-FR"/>
             </w:rPr>
           </w:pPr>
-          <w:hyperlink w:anchor="_Toc229057811" w:history="1">
+          <w:hyperlink w:anchor="_Toc229386149" w:history="1">
             <w:r>
               <w:rPr>
                 <w:rStyle w:val="Lienhypertexte"/>
@@ -1274,7 +1276,7 @@
                 <w:noProof/>
                 <w:webHidden/>
               </w:rPr>
-              <w:instrText xml:space="preserve"> PAGEREF _Toc229057811 \h </w:instrText>
+              <w:instrText xml:space="preserve"> PAGEREF _Toc229386149 \h </w:instrText>
             </w:r>
             <w:r>
               <w:rPr>
@@ -1317,7 +1319,7 @@
               <w:lang w:eastAsia="fr-FR"/>
             </w:rPr>
           </w:pPr>
-          <w:hyperlink w:anchor="_Toc229057812" w:history="1">
+          <w:hyperlink w:anchor="_Toc229386150" w:history="1">
             <w:r>
               <w:rPr>
                 <w:rStyle w:val="Lienhypertexte"/>
@@ -1344,7 +1346,7 @@
                 <w:noProof/>
                 <w:webHidden/>
               </w:rPr>
-              <w:instrText xml:space="preserve"> PAGEREF _Toc229057812 \h </w:instrText>
+              <w:instrText xml:space="preserve"> PAGEREF _Toc229386150 \h </w:instrText>
             </w:r>
             <w:r>
               <w:rPr>
@@ -1387,7 +1389,7 @@
               <w:lang w:eastAsia="fr-FR"/>
             </w:rPr>
           </w:pPr>
-          <w:hyperlink w:anchor="_Toc229057813" w:history="1">
+          <w:hyperlink w:anchor="_Toc229386151" w:history="1">
             <w:r>
               <w:rPr>
                 <w:rStyle w:val="Lienhypertexte"/>
@@ -1414,7 +1416,7 @@
                 <w:noProof/>
                 <w:webHidden/>
               </w:rPr>
-              <w:instrText xml:space="preserve"> PAGEREF _Toc229057813 \h </w:instrText>
+              <w:instrText xml:space="preserve"> PAGEREF _Toc229386151 \h </w:instrText>
             </w:r>
             <w:r>
               <w:rPr>
@@ -1457,7 +1459,7 @@
               <w:lang w:eastAsia="fr-FR"/>
             </w:rPr>
           </w:pPr>
-          <w:hyperlink w:anchor="_Toc229057814" w:history="1">
+          <w:hyperlink w:anchor="_Toc229386152" w:history="1">
             <w:r>
               <w:rPr>
                 <w:rStyle w:val="Lienhypertexte"/>
@@ -1484,7 +1486,7 @@
                 <w:noProof/>
                 <w:webHidden/>
               </w:rPr>
-              <w:instrText xml:space="preserve"> PAGEREF _Toc229057814 \h </w:instrText>
+              <w:instrText xml:space="preserve"> PAGEREF _Toc229386152 \h </w:instrText>
             </w:r>
             <w:r>
               <w:rPr>
@@ -1527,7 +1529,7 @@
               <w:lang w:eastAsia="fr-FR"/>
             </w:rPr>
           </w:pPr>
-          <w:hyperlink w:anchor="_Toc229057815" w:history="1">
+          <w:hyperlink w:anchor="_Toc229386153" w:history="1">
             <w:r>
               <w:rPr>
                 <w:rStyle w:val="Lienhypertexte"/>
@@ -1554,7 +1556,7 @@
                 <w:noProof/>
                 <w:webHidden/>
               </w:rPr>
-              <w:instrText xml:space="preserve"> PAGEREF _Toc229057815 \h </w:instrText>
+              <w:instrText xml:space="preserve"> PAGEREF _Toc229386153 \h </w:instrText>
             </w:r>
             <w:r>
               <w:rPr>
@@ -1597,7 +1599,7 @@
               <w:lang w:eastAsia="fr-FR"/>
             </w:rPr>
           </w:pPr>
-          <w:hyperlink w:anchor="_Toc229057816" w:history="1">
+          <w:hyperlink w:anchor="_Toc229386154" w:history="1">
             <w:r>
               <w:rPr>
                 <w:rStyle w:val="Lienhypertexte"/>
@@ -1624,7 +1626,7 @@
                 <w:noProof/>
                 <w:webHidden/>
               </w:rPr>
-              <w:instrText xml:space="preserve"> PAGEREF _Toc229057816 \h </w:instrText>
+              <w:instrText xml:space="preserve"> PAGEREF _Toc229386154 \h </w:instrText>
             </w:r>
             <w:r>
               <w:rPr>
@@ -1667,7 +1669,7 @@
               <w:lang w:eastAsia="fr-FR"/>
             </w:rPr>
           </w:pPr>
-          <w:hyperlink w:anchor="_Toc229057817" w:history="1">
+          <w:hyperlink w:anchor="_Toc229386155" w:history="1">
             <w:r>
               <w:rPr>
                 <w:rStyle w:val="Lienhypertexte"/>
@@ -1694,7 +1696,7 @@
                 <w:noProof/>
                 <w:webHidden/>
               </w:rPr>
-              <w:instrText xml:space="preserve"> PAGEREF _Toc229057817 \h </w:instrText>
+              <w:instrText xml:space="preserve"> PAGEREF _Toc229386155 \h </w:instrText>
             </w:r>
             <w:r>
               <w:rPr>
@@ -1737,7 +1739,7 @@
               <w:lang w:eastAsia="fr-FR"/>
             </w:rPr>
           </w:pPr>
-          <w:hyperlink w:anchor="_Toc229057818" w:history="1">
+          <w:hyperlink w:anchor="_Toc229386156" w:history="1">
             <w:r>
               <w:rPr>
                 <w:rStyle w:val="Lienhypertexte"/>
@@ -1764,7 +1766,7 @@
                 <w:noProof/>
                 <w:webHidden/>
               </w:rPr>
-              <w:instrText xml:space="preserve"> PAGEREF _Toc229057818 \h </w:instrText>
+              <w:instrText xml:space="preserve"> PAGEREF _Toc229386156 \h </w:instrText>
             </w:r>
             <w:r>
               <w:rPr>
@@ -1807,7 +1809,7 @@
               <w:lang w:eastAsia="fr-FR"/>
             </w:rPr>
           </w:pPr>
-          <w:hyperlink w:anchor="_Toc229057819" w:history="1">
+          <w:hyperlink w:anchor="_Toc229386157" w:history="1">
             <w:r>
               <w:rPr>
                 <w:rStyle w:val="Lienhypertexte"/>
@@ -1834,7 +1836,7 @@
                 <w:noProof/>
                 <w:webHidden/>
               </w:rPr>
-              <w:instrText xml:space="preserve"> PAGEREF _Toc229057819 \h </w:instrText>
+              <w:instrText xml:space="preserve"> PAGEREF _Toc229386157 \h </w:instrText>
             </w:r>
             <w:r>
               <w:rPr>
@@ -1877,7 +1879,7 @@
               <w:lang w:eastAsia="fr-FR"/>
             </w:rPr>
           </w:pPr>
-          <w:hyperlink w:anchor="_Toc229057820" w:history="1">
+          <w:hyperlink w:anchor="_Toc229386158" w:history="1">
             <w:r>
               <w:rPr>
                 <w:rStyle w:val="Lienhypertexte"/>
@@ -1904,7 +1906,7 @@
                 <w:noProof/>
                 <w:webHidden/>
               </w:rPr>
-              <w:instrText xml:space="preserve"> PAGEREF _Toc229057820 \h </w:instrText>
+              <w:instrText xml:space="preserve"> PAGEREF _Toc229386158 \h </w:instrText>
             </w:r>
             <w:r>
               <w:rPr>
@@ -1947,7 +1949,7 @@
               <w:lang w:eastAsia="fr-FR"/>
             </w:rPr>
           </w:pPr>
-          <w:hyperlink w:anchor="_Toc229057821" w:history="1">
+          <w:hyperlink w:anchor="_Toc229386159" w:history="1">
             <w:r>
               <w:rPr>
                 <w:rStyle w:val="Lienhypertexte"/>
@@ -1974,7 +1976,7 @@
                 <w:noProof/>
                 <w:webHidden/>
               </w:rPr>
-              <w:instrText xml:space="preserve"> PAGEREF _Toc229057821 \h </w:instrText>
+              <w:instrText xml:space="preserve"> PAGEREF _Toc229386159 \h </w:instrText>
             </w:r>
             <w:r>
               <w:rPr>
@@ -2017,7 +2019,7 @@
               <w:lang w:eastAsia="fr-FR"/>
             </w:rPr>
           </w:pPr>
-          <w:hyperlink w:anchor="_Toc229057822" w:history="1">
+          <w:hyperlink w:anchor="_Toc229386160" w:history="1">
             <w:r>
               <w:rPr>
                 <w:rStyle w:val="Lienhypertexte"/>
@@ -2044,7 +2046,7 @@
                 <w:noProof/>
                 <w:webHidden/>
               </w:rPr>
-              <w:instrText xml:space="preserve"> PAGEREF _Toc229057822 \h </w:instrText>
+              <w:instrText xml:space="preserve"> PAGEREF _Toc229386160 \h </w:instrText>
             </w:r>
             <w:r>
               <w:rPr>
@@ -2087,7 +2089,7 @@
               <w:lang w:eastAsia="fr-FR"/>
             </w:rPr>
           </w:pPr>
-          <w:hyperlink w:anchor="_Toc229057823" w:history="1">
+          <w:hyperlink w:anchor="_Toc229386161" w:history="1">
             <w:r>
               <w:rPr>
                 <w:rStyle w:val="Lienhypertexte"/>
@@ -2114,7 +2116,7 @@
                 <w:noProof/>
                 <w:webHidden/>
               </w:rPr>
-              <w:instrText xml:space="preserve"> PAGEREF _Toc229057823 \h </w:instrText>
+              <w:instrText xml:space="preserve"> PAGEREF _Toc229386161 \h </w:instrText>
             </w:r>
             <w:r>
               <w:rPr>
@@ -2157,7 +2159,7 @@
               <w:lang w:eastAsia="fr-FR"/>
             </w:rPr>
           </w:pPr>
-          <w:hyperlink w:anchor="_Toc229057824" w:history="1">
+          <w:hyperlink w:anchor="_Toc229386162" w:history="1">
             <w:r>
               <w:rPr>
                 <w:rStyle w:val="Lienhypertexte"/>
@@ -2184,7 +2186,7 @@
                 <w:noProof/>
                 <w:webHidden/>
               </w:rPr>
-              <w:instrText xml:space="preserve"> PAGEREF _Toc229057824 \h </w:instrText>
+              <w:instrText xml:space="preserve"> PAGEREF _Toc229386162 \h </w:instrText>
             </w:r>
             <w:r>
               <w:rPr>
@@ -2227,7 +2229,7 @@
               <w:lang w:eastAsia="fr-FR"/>
             </w:rPr>
           </w:pPr>
-          <w:hyperlink w:anchor="_Toc229057825" w:history="1">
+          <w:hyperlink w:anchor="_Toc229386163" w:history="1">
             <w:r>
               <w:rPr>
                 <w:rStyle w:val="Lienhypertexte"/>
@@ -2254,7 +2256,7 @@
                 <w:noProof/>
                 <w:webHidden/>
               </w:rPr>
-              <w:instrText xml:space="preserve"> PAGEREF _Toc229057825 \h </w:instrText>
+              <w:instrText xml:space="preserve"> PAGEREF _Toc229386163 \h </w:instrText>
             </w:r>
             <w:r>
               <w:rPr>
@@ -2297,7 +2299,7 @@
               <w:lang w:eastAsia="fr-FR"/>
             </w:rPr>
           </w:pPr>
-          <w:hyperlink w:anchor="_Toc229057826" w:history="1">
+          <w:hyperlink w:anchor="_Toc229386164" w:history="1">
             <w:r>
               <w:rPr>
                 <w:rStyle w:val="Lienhypertexte"/>
@@ -2324,7 +2326,7 @@
                 <w:noProof/>
                 <w:webHidden/>
               </w:rPr>
-              <w:instrText xml:space="preserve"> PAGEREF _Toc229057826 \h </w:instrText>
+              <w:instrText xml:space="preserve"> PAGEREF _Toc229386164 \h </w:instrText>
             </w:r>
             <w:r>
               <w:rPr>
@@ -2367,7 +2369,7 @@
               <w:lang w:eastAsia="fr-FR"/>
             </w:rPr>
           </w:pPr>
-          <w:hyperlink w:anchor="_Toc229057827" w:history="1">
+          <w:hyperlink w:anchor="_Toc229386165" w:history="1">
             <w:r>
               <w:rPr>
                 <w:rStyle w:val="Lienhypertexte"/>
@@ -2394,7 +2396,7 @@
                 <w:noProof/>
                 <w:webHidden/>
               </w:rPr>
-              <w:instrText xml:space="preserve"> PAGEREF _Toc229057827 \h </w:instrText>
+              <w:instrText xml:space="preserve"> PAGEREF _Toc229386165 \h </w:instrText>
             </w:r>
             <w:r>
               <w:rPr>
@@ -2437,7 +2439,7 @@
               <w:lang w:eastAsia="fr-FR"/>
             </w:rPr>
           </w:pPr>
-          <w:hyperlink w:anchor="_Toc229057828" w:history="1">
+          <w:hyperlink w:anchor="_Toc229386166" w:history="1">
             <w:r>
               <w:rPr>
                 <w:rStyle w:val="Lienhypertexte"/>
@@ -2464,7 +2466,7 @@
                 <w:noProof/>
                 <w:webHidden/>
               </w:rPr>
-              <w:instrText xml:space="preserve"> PAGEREF _Toc229057828 \h </w:instrText>
+              <w:instrText xml:space="preserve"> PAGEREF _Toc229386166 \h </w:instrText>
             </w:r>
             <w:r>
               <w:rPr>
@@ -2507,7 +2509,7 @@
               <w:lang w:eastAsia="fr-FR"/>
             </w:rPr>
           </w:pPr>
-          <w:hyperlink w:anchor="_Toc229057829" w:history="1">
+          <w:hyperlink w:anchor="_Toc229386167" w:history="1">
             <w:r>
               <w:rPr>
                 <w:rStyle w:val="Lienhypertexte"/>
@@ -2534,7 +2536,7 @@
                 <w:noProof/>
                 <w:webHidden/>
               </w:rPr>
-              <w:instrText xml:space="preserve"> PAGEREF _Toc229057829 \h </w:instrText>
+              <w:instrText xml:space="preserve"> PAGEREF _Toc229386167 \h </w:instrText>
             </w:r>
             <w:r>
               <w:rPr>
@@ -2577,7 +2579,7 @@
               <w:lang w:eastAsia="fr-FR"/>
             </w:rPr>
           </w:pPr>
-          <w:hyperlink w:anchor="_Toc229057830" w:history="1">
+          <w:hyperlink w:anchor="_Toc229386168" w:history="1">
             <w:r>
               <w:rPr>
                 <w:rStyle w:val="Lienhypertexte"/>
@@ -2604,7 +2606,7 @@
                 <w:noProof/>
                 <w:webHidden/>
               </w:rPr>
-              <w:instrText xml:space="preserve"> PAGEREF _Toc229057830 \h </w:instrText>
+              <w:instrText xml:space="preserve"> PAGEREF _Toc229386168 \h </w:instrText>
             </w:r>
             <w:r>
               <w:rPr>
@@ -2647,7 +2649,7 @@
               <w:lang w:eastAsia="fr-FR"/>
             </w:rPr>
           </w:pPr>
-          <w:hyperlink w:anchor="_Toc229057831" w:history="1">
+          <w:hyperlink w:anchor="_Toc229386169" w:history="1">
             <w:r>
               <w:rPr>
                 <w:rStyle w:val="Lienhypertexte"/>
@@ -2674,77 +2676,7 @@
                 <w:noProof/>
                 <w:webHidden/>
               </w:rPr>
-              <w:instrText xml:space="preserve"> PAGEREF _Toc229057831 \h </w:instrText>
-            </w:r>
-            <w:r>
-              <w:rPr>
-                <w:noProof/>
-                <w:webHidden/>
-              </w:rPr>
-            </w:r>
-            <w:r>
-              <w:rPr>
-                <w:noProof/>
-                <w:webHidden/>
-              </w:rPr>
-              <w:fldChar w:fldCharType="separate"/>
-            </w:r>
-            <w:r>
-              <w:rPr>
-                <w:noProof/>
-                <w:webHidden/>
-              </w:rPr>
-              <w:t>19</w:t>
-            </w:r>
-            <w:r>
-              <w:rPr>
-                <w:noProof/>
-                <w:webHidden/>
-              </w:rPr>
-              <w:fldChar w:fldCharType="end"/>
-            </w:r>
-          </w:hyperlink>
-        </w:p>
-        <w:p>
-          <w:pPr>
-            <w:pStyle w:val="TM3"/>
-            <w:tabs>
-              <w:tab w:val="right" w:leader="dot" w:pos="9062"/>
-            </w:tabs>
-            <w:rPr>
-              <w:rFonts w:eastAsiaTheme="minorEastAsia"/>
-              <w:noProof/>
-              <w:lang w:eastAsia="fr-FR"/>
-            </w:rPr>
-          </w:pPr>
-          <w:hyperlink w:anchor="_Toc229057832" w:history="1">
-            <w:r>
-              <w:rPr>
-                <w:rStyle w:val="Lienhypertexte"/>
-                <w:noProof/>
-              </w:rPr>
-              <w:t>Impossible de se connecter :</w:t>
-            </w:r>
-            <w:r>
-              <w:rPr>
-                <w:noProof/>
-                <w:webHidden/>
-              </w:rPr>
-              <w:tab/>
-            </w:r>
-            <w:r>
-              <w:rPr>
-                <w:noProof/>
-                <w:webHidden/>
-              </w:rPr>
-              <w:fldChar w:fldCharType="begin"/>
-            </w:r>
-            <w:r>
-              <w:rPr>
-                <w:noProof/>
-                <w:webHidden/>
-              </w:rPr>
-              <w:instrText xml:space="preserve"> PAGEREF _Toc229057832 \h </w:instrText>
+              <w:instrText xml:space="preserve"> PAGEREF _Toc229386169 \h </w:instrText>
             </w:r>
             <w:r>
               <w:rPr>
@@ -2805,7 +2737,7 @@
       <w:pPr>
         <w:pStyle w:val="MonTitre1"/>
       </w:pPr>
-      <w:bookmarkStart w:id="0" w:name="_Toc229057809"/>
+      <w:bookmarkStart w:id="0" w:name="_Toc229386147"/>
       <w:r>
         <w:lastRenderedPageBreak/>
         <w:t>Présentation de l’application :</w:t>
@@ -2824,7 +2756,7 @@
           <w:u w:val="single"/>
         </w:rPr>
       </w:pPr>
-      <w:bookmarkStart w:id="1" w:name="_Toc229057810"/>
+      <w:bookmarkStart w:id="1" w:name="_Toc229386148"/>
       <w:r>
         <w:rPr>
           <w:u w:val="single"/>
@@ -2901,7 +2833,7 @@
           <w:u w:val="single"/>
         </w:rPr>
       </w:pPr>
-      <w:bookmarkStart w:id="2" w:name="_Toc229057811"/>
+      <w:bookmarkStart w:id="2" w:name="_Toc229386149"/>
       <w:r>
         <w:rPr>
           <w:u w:val="single"/>
@@ -3010,7 +2942,7 @@
       <w:pPr>
         <w:pStyle w:val="Titre2"/>
       </w:pPr>
-      <w:bookmarkStart w:id="3" w:name="_Toc229057812"/>
+      <w:bookmarkStart w:id="3" w:name="_Toc229386150"/>
       <w:r>
         <w:lastRenderedPageBreak/>
         <w:t>Première connexion :</w:t>
@@ -3219,6 +3151,9 @@
     </w:p>
     <w:p>
       <w:r>
+        <w:rPr>
+          <w:noProof/>
+        </w:rPr>
         <w:lastRenderedPageBreak/>
         <w:drawing>
           <wp:anchor distT="0" distB="0" distL="114300" distR="114300" simplePos="0" relativeHeight="251664384" behindDoc="0" locked="0" layoutInCell="1" allowOverlap="1" wp14:anchorId="4F122D17" wp14:editId="7432A6F4">
@@ -3371,7 +3306,7 @@
       <w:pPr>
         <w:pStyle w:val="Titre2"/>
       </w:pPr>
-      <w:bookmarkStart w:id="4" w:name="_Toc229057813"/>
+      <w:bookmarkStart w:id="4" w:name="_Toc229386151"/>
       <w:r>
         <w:lastRenderedPageBreak/>
         <w:t>La vue générale de l’interface :</w:t>
@@ -3515,7 +3450,7 @@
       <w:pPr>
         <w:pStyle w:val="Titre2"/>
       </w:pPr>
-      <w:bookmarkStart w:id="5" w:name="_Toc229057814"/>
+      <w:bookmarkStart w:id="5" w:name="_Toc229386152"/>
       <w:r>
         <w:lastRenderedPageBreak/>
         <w:t>Le tableau de bord :</w:t>
@@ -3653,7 +3588,7 @@
       <w:pPr>
         <w:pStyle w:val="Titre2"/>
       </w:pPr>
-      <w:bookmarkStart w:id="6" w:name="_Toc229057815"/>
+      <w:bookmarkStart w:id="6" w:name="_Toc229386153"/>
       <w:r>
         <w:t>La terminologie des différents statuts :</w:t>
       </w:r>
@@ -3746,7 +3681,7 @@
       <w:pPr>
         <w:pStyle w:val="Titre2"/>
       </w:pPr>
-      <w:bookmarkStart w:id="7" w:name="_Toc229057816"/>
+      <w:bookmarkStart w:id="7" w:name="_Toc229386154"/>
       <w:r>
         <w:lastRenderedPageBreak/>
         <w:t>Guide pour les comptes utilisateurs :</w:t>
@@ -3766,7 +3701,7 @@
           <w:u w:val="single"/>
         </w:rPr>
       </w:pPr>
-      <w:bookmarkStart w:id="8" w:name="_Toc229057817"/>
+      <w:bookmarkStart w:id="8" w:name="_Toc229386155"/>
       <w:r>
         <w:rPr>
           <w:u w:val="single"/>
@@ -3884,7 +3819,7 @@
           <w:noProof/>
         </w:rPr>
         <w:drawing>
-          <wp:anchor distT="0" distB="0" distL="114300" distR="114300" simplePos="0" relativeHeight="251668480" behindDoc="0" locked="0" layoutInCell="1" allowOverlap="1" wp14:anchorId="34945100" wp14:editId="6E841893">
+          <wp:anchor distT="0" distB="0" distL="114300" distR="114300" simplePos="0" relativeHeight="251668480" behindDoc="0" locked="0" layoutInCell="1" allowOverlap="1" wp14:anchorId="34945100" wp14:editId="7CDAB57B">
             <wp:simplePos x="0" y="0"/>
             <wp:positionH relativeFrom="margin">
               <wp:posOffset>-155311</wp:posOffset>
@@ -4024,7 +3959,7 @@
           <w:u w:val="single"/>
         </w:rPr>
       </w:pPr>
-      <w:bookmarkStart w:id="9" w:name="_Toc229057818"/>
+      <w:bookmarkStart w:id="9" w:name="_Toc229386156"/>
       <w:r>
         <w:rPr>
           <w:u w:val="single"/>
@@ -4335,7 +4270,7 @@
           <w:u w:val="single"/>
         </w:rPr>
       </w:pPr>
-      <w:bookmarkStart w:id="10" w:name="_Toc229057819"/>
+      <w:bookmarkStart w:id="10" w:name="_Toc229386157"/>
       <w:r>
         <w:rPr>
           <w:u w:val="single"/>
@@ -4750,7 +4685,7 @@
           <w:u w:val="single"/>
         </w:rPr>
       </w:pPr>
-      <w:bookmarkStart w:id="11" w:name="_Toc229057820"/>
+      <w:bookmarkStart w:id="11" w:name="_Toc229386158"/>
       <w:r>
         <w:rPr>
           <w:u w:val="single"/>
@@ -4821,7 +4756,7 @@
           <w:u w:val="single"/>
         </w:rPr>
       </w:pPr>
-      <w:bookmarkStart w:id="12" w:name="_Toc229057821"/>
+      <w:bookmarkStart w:id="12" w:name="_Toc229386159"/>
       <w:r>
         <w:rPr>
           <w:u w:val="single"/>
@@ -4981,7 +4916,7 @@
           <w:u w:val="single"/>
         </w:rPr>
       </w:pPr>
-      <w:bookmarkStart w:id="13" w:name="_Toc229057822"/>
+      <w:bookmarkStart w:id="13" w:name="_Toc229386160"/>
       <w:r>
         <w:rPr>
           <w:u w:val="single"/>
@@ -5082,7 +5017,7 @@
           <w:u w:val="single"/>
         </w:rPr>
       </w:pPr>
-      <w:bookmarkStart w:id="14" w:name="_Toc229057823"/>
+      <w:bookmarkStart w:id="14" w:name="_Toc229386161"/>
       <w:r>
         <w:rPr>
           <w:u w:val="single"/>
@@ -5298,7 +5233,7 @@
           <w:u w:val="single"/>
         </w:rPr>
       </w:pPr>
-      <w:bookmarkStart w:id="15" w:name="_Toc229057824"/>
+      <w:bookmarkStart w:id="15" w:name="_Toc229386162"/>
       <w:r>
         <w:rPr>
           <w:u w:val="single"/>
@@ -5550,7 +5485,7 @@
       <w:pPr>
         <w:pStyle w:val="Titre2"/>
       </w:pPr>
-      <w:bookmarkStart w:id="16" w:name="_Toc229057825"/>
+      <w:bookmarkStart w:id="16" w:name="_Toc229386163"/>
       <w:r>
         <w:t>Cas particulier : Demande de fermeture :</w:t>
       </w:r>
@@ -5762,7 +5697,7 @@
       <w:pPr>
         <w:pStyle w:val="Titre2"/>
       </w:pPr>
-      <w:bookmarkStart w:id="17" w:name="_Toc229057826"/>
+      <w:bookmarkStart w:id="17" w:name="_Toc229386164"/>
       <w:r>
         <w:lastRenderedPageBreak/>
         <w:t>Guide administrateur :</w:t>
@@ -5811,7 +5746,7 @@
           <w:noProof/>
         </w:rPr>
         <w:drawing>
-          <wp:anchor distT="0" distB="0" distL="114300" distR="114300" simplePos="0" relativeHeight="251681792" behindDoc="0" locked="0" layoutInCell="1" allowOverlap="1" wp14:anchorId="13BFD946" wp14:editId="73CBEF0B">
+          <wp:anchor distT="0" distB="0" distL="114300" distR="114300" simplePos="0" relativeHeight="251681792" behindDoc="0" locked="0" layoutInCell="1" allowOverlap="1" wp14:anchorId="13BFD946" wp14:editId="1551C40C">
             <wp:simplePos x="0" y="0"/>
             <wp:positionH relativeFrom="margin">
               <wp:posOffset>-281940</wp:posOffset>
@@ -5893,7 +5828,7 @@
           <w:u w:val="single"/>
         </w:rPr>
       </w:pPr>
-      <w:bookmarkStart w:id="18" w:name="_Toc229057827"/>
+      <w:bookmarkStart w:id="18" w:name="_Toc229386165"/>
       <w:r>
         <w:rPr>
           <w:u w:val="single"/>
@@ -6648,7 +6583,7 @@
       <w:pPr>
         <w:pStyle w:val="Titre3"/>
       </w:pPr>
-      <w:bookmarkStart w:id="19" w:name="_Toc229057828"/>
+      <w:bookmarkStart w:id="19" w:name="_Toc229386166"/>
       <w:r>
         <w:t>Gérer les services :</w:t>
       </w:r>
@@ -6996,7 +6931,7 @@
       <w:pPr>
         <w:pStyle w:val="Titre3"/>
       </w:pPr>
-      <w:bookmarkStart w:id="20" w:name="_Toc229057829"/>
+      <w:bookmarkStart w:id="20" w:name="_Toc229386167"/>
       <w:r>
         <w:t>Gérer les logiciels :</w:t>
       </w:r>
@@ -7631,7 +7566,7 @@
       <w:pPr>
         <w:pStyle w:val="Titre2"/>
       </w:pPr>
-      <w:bookmarkStart w:id="21" w:name="_Toc229057830"/>
+      <w:bookmarkStart w:id="21" w:name="_Toc229386168"/>
       <w:r>
         <w:t>Notifications et relances automatiques :</w:t>
       </w:r>
@@ -7755,7 +7690,7 @@
       <w:pPr>
         <w:pStyle w:val="Titre2"/>
       </w:pPr>
-      <w:bookmarkStart w:id="22" w:name="_Toc229057831"/>
+      <w:bookmarkStart w:id="22" w:name="_Toc229386169"/>
       <w:r>
         <w:t>Que faire en cas de problème :</w:t>
       </w:r>
@@ -11332,6 +11267,7 @@
   <w:style w:type="character" w:default="1" w:styleId="Policepardfaut">
     <w:name w:val="Default Paragraph Font"/>
     <w:uiPriority w:val="1"/>
+    <w:semiHidden/>
     <w:unhideWhenUsed/>
   </w:style>
   <w:style w:type="table" w:default="1" w:styleId="TableauNormal">

</xml_diff>

<commit_message>
mise à jour du guide utilisateur
</commit_message>
<xml_diff>
--- a/public/GuideUtilisateurGDAP.docx
+++ b/public/GuideUtilisateurGDAP.docx
@@ -1109,7 +1109,7 @@
           <w:r>
             <w:fldChar w:fldCharType="separate"/>
           </w:r>
-          <w:hyperlink w:anchor="_Toc229386147" w:history="1">
+          <w:hyperlink w:anchor="_Toc229581938" w:history="1">
             <w:r>
               <w:rPr>
                 <w:rStyle w:val="Lienhypertexte"/>
@@ -1136,7 +1136,7 @@
                 <w:noProof/>
                 <w:webHidden/>
               </w:rPr>
-              <w:instrText xml:space="preserve"> PAGEREF _Toc229386147 \h </w:instrText>
+              <w:instrText xml:space="preserve"> PAGEREF _Toc229581938 \h </w:instrText>
             </w:r>
             <w:r>
               <w:rPr>
@@ -1179,7 +1179,7 @@
               <w:lang w:eastAsia="fr-FR"/>
             </w:rPr>
           </w:pPr>
-          <w:hyperlink w:anchor="_Toc229386148" w:history="1">
+          <w:hyperlink w:anchor="_Toc229581939" w:history="1">
             <w:r>
               <w:rPr>
                 <w:rStyle w:val="Lienhypertexte"/>
@@ -1206,7 +1206,7 @@
                 <w:noProof/>
                 <w:webHidden/>
               </w:rPr>
-              <w:instrText xml:space="preserve"> PAGEREF _Toc229386148 \h </w:instrText>
+              <w:instrText xml:space="preserve"> PAGEREF _Toc229581939 \h </w:instrText>
             </w:r>
             <w:r>
               <w:rPr>
@@ -1249,7 +1249,7 @@
               <w:lang w:eastAsia="fr-FR"/>
             </w:rPr>
           </w:pPr>
-          <w:hyperlink w:anchor="_Toc229386149" w:history="1">
+          <w:hyperlink w:anchor="_Toc229581940" w:history="1">
             <w:r>
               <w:rPr>
                 <w:rStyle w:val="Lienhypertexte"/>
@@ -1276,7 +1276,7 @@
                 <w:noProof/>
                 <w:webHidden/>
               </w:rPr>
-              <w:instrText xml:space="preserve"> PAGEREF _Toc229386149 \h </w:instrText>
+              <w:instrText xml:space="preserve"> PAGEREF _Toc229581940 \h </w:instrText>
             </w:r>
             <w:r>
               <w:rPr>
@@ -1319,7 +1319,7 @@
               <w:lang w:eastAsia="fr-FR"/>
             </w:rPr>
           </w:pPr>
-          <w:hyperlink w:anchor="_Toc229386150" w:history="1">
+          <w:hyperlink w:anchor="_Toc229581941" w:history="1">
             <w:r>
               <w:rPr>
                 <w:rStyle w:val="Lienhypertexte"/>
@@ -1346,7 +1346,7 @@
                 <w:noProof/>
                 <w:webHidden/>
               </w:rPr>
-              <w:instrText xml:space="preserve"> PAGEREF _Toc229386150 \h </w:instrText>
+              <w:instrText xml:space="preserve"> PAGEREF _Toc229581941 \h </w:instrText>
             </w:r>
             <w:r>
               <w:rPr>
@@ -1389,7 +1389,7 @@
               <w:lang w:eastAsia="fr-FR"/>
             </w:rPr>
           </w:pPr>
-          <w:hyperlink w:anchor="_Toc229386151" w:history="1">
+          <w:hyperlink w:anchor="_Toc229581942" w:history="1">
             <w:r>
               <w:rPr>
                 <w:rStyle w:val="Lienhypertexte"/>
@@ -1416,7 +1416,7 @@
                 <w:noProof/>
                 <w:webHidden/>
               </w:rPr>
-              <w:instrText xml:space="preserve"> PAGEREF _Toc229386151 \h </w:instrText>
+              <w:instrText xml:space="preserve"> PAGEREF _Toc229581942 \h </w:instrText>
             </w:r>
             <w:r>
               <w:rPr>
@@ -1436,7 +1436,7 @@
                 <w:noProof/>
                 <w:webHidden/>
               </w:rPr>
-              <w:t>5</w:t>
+              <w:t>4</w:t>
             </w:r>
             <w:r>
               <w:rPr>
@@ -1459,7 +1459,7 @@
               <w:lang w:eastAsia="fr-FR"/>
             </w:rPr>
           </w:pPr>
-          <w:hyperlink w:anchor="_Toc229386152" w:history="1">
+          <w:hyperlink w:anchor="_Toc229581943" w:history="1">
             <w:r>
               <w:rPr>
                 <w:rStyle w:val="Lienhypertexte"/>
@@ -1486,7 +1486,7 @@
                 <w:noProof/>
                 <w:webHidden/>
               </w:rPr>
-              <w:instrText xml:space="preserve"> PAGEREF _Toc229386152 \h </w:instrText>
+              <w:instrText xml:space="preserve"> PAGEREF _Toc229581943 \h </w:instrText>
             </w:r>
             <w:r>
               <w:rPr>
@@ -1506,7 +1506,7 @@
                 <w:noProof/>
                 <w:webHidden/>
               </w:rPr>
-              <w:t>6</w:t>
+              <w:t>5</w:t>
             </w:r>
             <w:r>
               <w:rPr>
@@ -1529,7 +1529,7 @@
               <w:lang w:eastAsia="fr-FR"/>
             </w:rPr>
           </w:pPr>
-          <w:hyperlink w:anchor="_Toc229386153" w:history="1">
+          <w:hyperlink w:anchor="_Toc229581944" w:history="1">
             <w:r>
               <w:rPr>
                 <w:rStyle w:val="Lienhypertexte"/>
@@ -1556,7 +1556,7 @@
                 <w:noProof/>
                 <w:webHidden/>
               </w:rPr>
-              <w:instrText xml:space="preserve"> PAGEREF _Toc229386153 \h </w:instrText>
+              <w:instrText xml:space="preserve"> PAGEREF _Toc229581944 \h </w:instrText>
             </w:r>
             <w:r>
               <w:rPr>
@@ -1576,7 +1576,7 @@
                 <w:noProof/>
                 <w:webHidden/>
               </w:rPr>
-              <w:t>6</w:t>
+              <w:t>5</w:t>
             </w:r>
             <w:r>
               <w:rPr>
@@ -1599,7 +1599,7 @@
               <w:lang w:eastAsia="fr-FR"/>
             </w:rPr>
           </w:pPr>
-          <w:hyperlink w:anchor="_Toc229386154" w:history="1">
+          <w:hyperlink w:anchor="_Toc229581945" w:history="1">
             <w:r>
               <w:rPr>
                 <w:rStyle w:val="Lienhypertexte"/>
@@ -1626,7 +1626,7 @@
                 <w:noProof/>
                 <w:webHidden/>
               </w:rPr>
-              <w:instrText xml:space="preserve"> PAGEREF _Toc229386154 \h </w:instrText>
+              <w:instrText xml:space="preserve"> PAGEREF _Toc229581945 \h </w:instrText>
             </w:r>
             <w:r>
               <w:rPr>
@@ -1646,7 +1646,7 @@
                 <w:noProof/>
                 <w:webHidden/>
               </w:rPr>
-              <w:t>7</w:t>
+              <w:t>6</w:t>
             </w:r>
             <w:r>
               <w:rPr>
@@ -1669,7 +1669,7 @@
               <w:lang w:eastAsia="fr-FR"/>
             </w:rPr>
           </w:pPr>
-          <w:hyperlink w:anchor="_Toc229386155" w:history="1">
+          <w:hyperlink w:anchor="_Toc229581946" w:history="1">
             <w:r>
               <w:rPr>
                 <w:rStyle w:val="Lienhypertexte"/>
@@ -1696,7 +1696,7 @@
                 <w:noProof/>
                 <w:webHidden/>
               </w:rPr>
-              <w:instrText xml:space="preserve"> PAGEREF _Toc229386155 \h </w:instrText>
+              <w:instrText xml:space="preserve"> PAGEREF _Toc229581946 \h </w:instrText>
             </w:r>
             <w:r>
               <w:rPr>
@@ -1716,7 +1716,7 @@
                 <w:noProof/>
                 <w:webHidden/>
               </w:rPr>
-              <w:t>7</w:t>
+              <w:t>6</w:t>
             </w:r>
             <w:r>
               <w:rPr>
@@ -1739,7 +1739,7 @@
               <w:lang w:eastAsia="fr-FR"/>
             </w:rPr>
           </w:pPr>
-          <w:hyperlink w:anchor="_Toc229386156" w:history="1">
+          <w:hyperlink w:anchor="_Toc229581947" w:history="1">
             <w:r>
               <w:rPr>
                 <w:rStyle w:val="Lienhypertexte"/>
@@ -1766,7 +1766,7 @@
                 <w:noProof/>
                 <w:webHidden/>
               </w:rPr>
-              <w:instrText xml:space="preserve"> PAGEREF _Toc229386156 \h </w:instrText>
+              <w:instrText xml:space="preserve"> PAGEREF _Toc229581947 \h </w:instrText>
             </w:r>
             <w:r>
               <w:rPr>
@@ -1786,7 +1786,7 @@
                 <w:noProof/>
                 <w:webHidden/>
               </w:rPr>
-              <w:t>8</w:t>
+              <w:t>7</w:t>
             </w:r>
             <w:r>
               <w:rPr>
@@ -1809,7 +1809,7 @@
               <w:lang w:eastAsia="fr-FR"/>
             </w:rPr>
           </w:pPr>
-          <w:hyperlink w:anchor="_Toc229386157" w:history="1">
+          <w:hyperlink w:anchor="_Toc229581948" w:history="1">
             <w:r>
               <w:rPr>
                 <w:rStyle w:val="Lienhypertexte"/>
@@ -1836,7 +1836,7 @@
                 <w:noProof/>
                 <w:webHidden/>
               </w:rPr>
-              <w:instrText xml:space="preserve"> PAGEREF _Toc229386157 \h </w:instrText>
+              <w:instrText xml:space="preserve"> PAGEREF _Toc229581948 \h </w:instrText>
             </w:r>
             <w:r>
               <w:rPr>
@@ -1856,7 +1856,7 @@
                 <w:noProof/>
                 <w:webHidden/>
               </w:rPr>
-              <w:t>9</w:t>
+              <w:t>8</w:t>
             </w:r>
             <w:r>
               <w:rPr>
@@ -1879,7 +1879,7 @@
               <w:lang w:eastAsia="fr-FR"/>
             </w:rPr>
           </w:pPr>
-          <w:hyperlink w:anchor="_Toc229386158" w:history="1">
+          <w:hyperlink w:anchor="_Toc229581949" w:history="1">
             <w:r>
               <w:rPr>
                 <w:rStyle w:val="Lienhypertexte"/>
@@ -1906,7 +1906,7 @@
                 <w:noProof/>
                 <w:webHidden/>
               </w:rPr>
-              <w:instrText xml:space="preserve"> PAGEREF _Toc229386158 \h </w:instrText>
+              <w:instrText xml:space="preserve"> PAGEREF _Toc229581949 \h </w:instrText>
             </w:r>
             <w:r>
               <w:rPr>
@@ -1949,7 +1949,7 @@
               <w:lang w:eastAsia="fr-FR"/>
             </w:rPr>
           </w:pPr>
-          <w:hyperlink w:anchor="_Toc229386159" w:history="1">
+          <w:hyperlink w:anchor="_Toc229581950" w:history="1">
             <w:r>
               <w:rPr>
                 <w:rStyle w:val="Lienhypertexte"/>
@@ -1976,7 +1976,7 @@
                 <w:noProof/>
                 <w:webHidden/>
               </w:rPr>
-              <w:instrText xml:space="preserve"> PAGEREF _Toc229386159 \h </w:instrText>
+              <w:instrText xml:space="preserve"> PAGEREF _Toc229581950 \h </w:instrText>
             </w:r>
             <w:r>
               <w:rPr>
@@ -2019,7 +2019,7 @@
               <w:lang w:eastAsia="fr-FR"/>
             </w:rPr>
           </w:pPr>
-          <w:hyperlink w:anchor="_Toc229386160" w:history="1">
+          <w:hyperlink w:anchor="_Toc229581951" w:history="1">
             <w:r>
               <w:rPr>
                 <w:rStyle w:val="Lienhypertexte"/>
@@ -2046,7 +2046,7 @@
                 <w:noProof/>
                 <w:webHidden/>
               </w:rPr>
-              <w:instrText xml:space="preserve"> PAGEREF _Toc229386160 \h </w:instrText>
+              <w:instrText xml:space="preserve"> PAGEREF _Toc229581951 \h </w:instrText>
             </w:r>
             <w:r>
               <w:rPr>
@@ -2089,7 +2089,7 @@
               <w:lang w:eastAsia="fr-FR"/>
             </w:rPr>
           </w:pPr>
-          <w:hyperlink w:anchor="_Toc229386161" w:history="1">
+          <w:hyperlink w:anchor="_Toc229581952" w:history="1">
             <w:r>
               <w:rPr>
                 <w:rStyle w:val="Lienhypertexte"/>
@@ -2116,7 +2116,7 @@
                 <w:noProof/>
                 <w:webHidden/>
               </w:rPr>
-              <w:instrText xml:space="preserve"> PAGEREF _Toc229386161 \h </w:instrText>
+              <w:instrText xml:space="preserve"> PAGEREF _Toc229581952 \h </w:instrText>
             </w:r>
             <w:r>
               <w:rPr>
@@ -2159,7 +2159,7 @@
               <w:lang w:eastAsia="fr-FR"/>
             </w:rPr>
           </w:pPr>
-          <w:hyperlink w:anchor="_Toc229386162" w:history="1">
+          <w:hyperlink w:anchor="_Toc229581953" w:history="1">
             <w:r>
               <w:rPr>
                 <w:rStyle w:val="Lienhypertexte"/>
@@ -2186,7 +2186,7 @@
                 <w:noProof/>
                 <w:webHidden/>
               </w:rPr>
-              <w:instrText xml:space="preserve"> PAGEREF _Toc229386162 \h </w:instrText>
+              <w:instrText xml:space="preserve"> PAGEREF _Toc229581953 \h </w:instrText>
             </w:r>
             <w:r>
               <w:rPr>
@@ -2229,7 +2229,7 @@
               <w:lang w:eastAsia="fr-FR"/>
             </w:rPr>
           </w:pPr>
-          <w:hyperlink w:anchor="_Toc229386163" w:history="1">
+          <w:hyperlink w:anchor="_Toc229581954" w:history="1">
             <w:r>
               <w:rPr>
                 <w:rStyle w:val="Lienhypertexte"/>
@@ -2256,7 +2256,7 @@
                 <w:noProof/>
                 <w:webHidden/>
               </w:rPr>
-              <w:instrText xml:space="preserve"> PAGEREF _Toc229386163 \h </w:instrText>
+              <w:instrText xml:space="preserve"> PAGEREF _Toc229581954 \h </w:instrText>
             </w:r>
             <w:r>
               <w:rPr>
@@ -2276,7 +2276,7 @@
                 <w:noProof/>
                 <w:webHidden/>
               </w:rPr>
-              <w:t>14</w:t>
+              <w:t>15</w:t>
             </w:r>
             <w:r>
               <w:rPr>
@@ -2299,7 +2299,7 @@
               <w:lang w:eastAsia="fr-FR"/>
             </w:rPr>
           </w:pPr>
-          <w:hyperlink w:anchor="_Toc229386164" w:history="1">
+          <w:hyperlink w:anchor="_Toc229581955" w:history="1">
             <w:r>
               <w:rPr>
                 <w:rStyle w:val="Lienhypertexte"/>
@@ -2326,7 +2326,7 @@
                 <w:noProof/>
                 <w:webHidden/>
               </w:rPr>
-              <w:instrText xml:space="preserve"> PAGEREF _Toc229386164 \h </w:instrText>
+              <w:instrText xml:space="preserve"> PAGEREF _Toc229581955 \h </w:instrText>
             </w:r>
             <w:r>
               <w:rPr>
@@ -2346,7 +2346,7 @@
                 <w:noProof/>
                 <w:webHidden/>
               </w:rPr>
-              <w:t>15</w:t>
+              <w:t>16</w:t>
             </w:r>
             <w:r>
               <w:rPr>
@@ -2369,7 +2369,7 @@
               <w:lang w:eastAsia="fr-FR"/>
             </w:rPr>
           </w:pPr>
-          <w:hyperlink w:anchor="_Toc229386165" w:history="1">
+          <w:hyperlink w:anchor="_Toc229581956" w:history="1">
             <w:r>
               <w:rPr>
                 <w:rStyle w:val="Lienhypertexte"/>
@@ -2396,7 +2396,7 @@
                 <w:noProof/>
                 <w:webHidden/>
               </w:rPr>
-              <w:instrText xml:space="preserve"> PAGEREF _Toc229386165 \h </w:instrText>
+              <w:instrText xml:space="preserve"> PAGEREF _Toc229581956 \h </w:instrText>
             </w:r>
             <w:r>
               <w:rPr>
@@ -2416,7 +2416,7 @@
                 <w:noProof/>
                 <w:webHidden/>
               </w:rPr>
-              <w:t>15</w:t>
+              <w:t>16</w:t>
             </w:r>
             <w:r>
               <w:rPr>
@@ -2439,7 +2439,7 @@
               <w:lang w:eastAsia="fr-FR"/>
             </w:rPr>
           </w:pPr>
-          <w:hyperlink w:anchor="_Toc229386166" w:history="1">
+          <w:hyperlink w:anchor="_Toc229581957" w:history="1">
             <w:r>
               <w:rPr>
                 <w:rStyle w:val="Lienhypertexte"/>
@@ -2466,7 +2466,7 @@
                 <w:noProof/>
                 <w:webHidden/>
               </w:rPr>
-              <w:instrText xml:space="preserve"> PAGEREF _Toc229386166 \h </w:instrText>
+              <w:instrText xml:space="preserve"> PAGEREF _Toc229581957 \h </w:instrText>
             </w:r>
             <w:r>
               <w:rPr>
@@ -2486,7 +2486,7 @@
                 <w:noProof/>
                 <w:webHidden/>
               </w:rPr>
-              <w:t>17</w:t>
+              <w:t>18</w:t>
             </w:r>
             <w:r>
               <w:rPr>
@@ -2509,7 +2509,7 @@
               <w:lang w:eastAsia="fr-FR"/>
             </w:rPr>
           </w:pPr>
-          <w:hyperlink w:anchor="_Toc229386167" w:history="1">
+          <w:hyperlink w:anchor="_Toc229581958" w:history="1">
             <w:r>
               <w:rPr>
                 <w:rStyle w:val="Lienhypertexte"/>
@@ -2536,7 +2536,7 @@
                 <w:noProof/>
                 <w:webHidden/>
               </w:rPr>
-              <w:instrText xml:space="preserve"> PAGEREF _Toc229386167 \h </w:instrText>
+              <w:instrText xml:space="preserve"> PAGEREF _Toc229581958 \h </w:instrText>
             </w:r>
             <w:r>
               <w:rPr>
@@ -2556,7 +2556,7 @@
                 <w:noProof/>
                 <w:webHidden/>
               </w:rPr>
-              <w:t>18</w:t>
+              <w:t>19</w:t>
             </w:r>
             <w:r>
               <w:rPr>
@@ -2579,7 +2579,7 @@
               <w:lang w:eastAsia="fr-FR"/>
             </w:rPr>
           </w:pPr>
-          <w:hyperlink w:anchor="_Toc229386168" w:history="1">
+          <w:hyperlink w:anchor="_Toc229581959" w:history="1">
             <w:r>
               <w:rPr>
                 <w:rStyle w:val="Lienhypertexte"/>
@@ -2606,7 +2606,7 @@
                 <w:noProof/>
                 <w:webHidden/>
               </w:rPr>
-              <w:instrText xml:space="preserve"> PAGEREF _Toc229386168 \h </w:instrText>
+              <w:instrText xml:space="preserve"> PAGEREF _Toc229581959 \h </w:instrText>
             </w:r>
             <w:r>
               <w:rPr>
@@ -2626,7 +2626,7 @@
                 <w:noProof/>
                 <w:webHidden/>
               </w:rPr>
-              <w:t>19</w:t>
+              <w:t>20</w:t>
             </w:r>
             <w:r>
               <w:rPr>
@@ -2649,7 +2649,7 @@
               <w:lang w:eastAsia="fr-FR"/>
             </w:rPr>
           </w:pPr>
-          <w:hyperlink w:anchor="_Toc229386169" w:history="1">
+          <w:hyperlink w:anchor="_Toc229581960" w:history="1">
             <w:r>
               <w:rPr>
                 <w:rStyle w:val="Lienhypertexte"/>
@@ -2676,7 +2676,7 @@
                 <w:noProof/>
                 <w:webHidden/>
               </w:rPr>
-              <w:instrText xml:space="preserve"> PAGEREF _Toc229386169 \h </w:instrText>
+              <w:instrText xml:space="preserve"> PAGEREF _Toc229581960 \h </w:instrText>
             </w:r>
             <w:r>
               <w:rPr>
@@ -2696,7 +2696,7 @@
                 <w:noProof/>
                 <w:webHidden/>
               </w:rPr>
-              <w:t>19</w:t>
+              <w:t>20</w:t>
             </w:r>
             <w:r>
               <w:rPr>
@@ -2737,7 +2737,7 @@
       <w:pPr>
         <w:pStyle w:val="MonTitre1"/>
       </w:pPr>
-      <w:bookmarkStart w:id="0" w:name="_Toc229386147"/>
+      <w:bookmarkStart w:id="0" w:name="_Toc229581938"/>
       <w:r>
         <w:lastRenderedPageBreak/>
         <w:t>Présentation de l’application :</w:t>
@@ -2745,6 +2745,9 @@
       <w:bookmarkEnd w:id="0"/>
     </w:p>
     <w:p>
+      <w:pPr>
+        <w:jc w:val="both"/>
+      </w:pPr>
       <w:r>
         <w:t>GDAP (Gestion des Accès du Plessis) est un outil de gestion interne qui permet de centraliser l’ensemble des demandes d’accès des agents mairie.</w:t>
       </w:r>
@@ -2756,7 +2759,7 @@
           <w:u w:val="single"/>
         </w:rPr>
       </w:pPr>
-      <w:bookmarkStart w:id="1" w:name="_Toc229386148"/>
+      <w:bookmarkStart w:id="1" w:name="_Toc229581939"/>
       <w:r>
         <w:rPr>
           <w:u w:val="single"/>
@@ -2766,11 +2769,17 @@
       <w:bookmarkEnd w:id="1"/>
     </w:p>
     <w:p>
+      <w:pPr>
+        <w:jc w:val="both"/>
+      </w:pPr>
       <w:r>
         <w:tab/>
         <w:t>-</w:t>
       </w:r>
       <w:r>
+        <w:t xml:space="preserve"> </w:t>
+      </w:r>
+      <w:r>
         <w:t>de</w:t>
       </w:r>
       <w:r>
@@ -2778,6 +2787,9 @@
       </w:r>
     </w:p>
     <w:p>
+      <w:pPr>
+        <w:jc w:val="both"/>
+      </w:pPr>
       <w:r>
         <w:tab/>
         <w:t xml:space="preserve">- </w:t>
@@ -2790,6 +2802,9 @@
       </w:r>
     </w:p>
     <w:p>
+      <w:pPr>
+        <w:jc w:val="both"/>
+      </w:pPr>
       <w:r>
         <w:tab/>
         <w:t xml:space="preserve">- </w:t>
@@ -2802,6 +2817,9 @@
       </w:r>
     </w:p>
     <w:p>
+      <w:pPr>
+        <w:jc w:val="both"/>
+      </w:pPr>
       <w:r>
         <w:tab/>
         <w:t xml:space="preserve">- </w:t>
@@ -2814,6 +2832,9 @@
       </w:r>
     </w:p>
     <w:p>
+      <w:pPr>
+        <w:jc w:val="both"/>
+      </w:pPr>
       <w:r>
         <w:tab/>
         <w:t xml:space="preserve">- </w:t>
@@ -2833,7 +2854,7 @@
           <w:u w:val="single"/>
         </w:rPr>
       </w:pPr>
-      <w:bookmarkStart w:id="2" w:name="_Toc229386149"/>
+      <w:bookmarkStart w:id="2" w:name="_Toc229581940"/>
       <w:r>
         <w:rPr>
           <w:u w:val="single"/>
@@ -2843,24 +2864,36 @@
       <w:bookmarkEnd w:id="2"/>
     </w:p>
     <w:p>
+      <w:pPr>
+        <w:jc w:val="both"/>
+      </w:pPr>
       <w:r>
         <w:tab/>
         <w:t>- de centraliser l’ensemble des demandes dans un seul outil</w:t>
       </w:r>
     </w:p>
     <w:p>
+      <w:pPr>
+        <w:jc w:val="both"/>
+      </w:pPr>
       <w:r>
         <w:tab/>
         <w:t>- standardiser les validations (avec des commentaires obligatoires)</w:t>
       </w:r>
     </w:p>
     <w:p>
+      <w:pPr>
+        <w:jc w:val="both"/>
+      </w:pPr>
       <w:r>
         <w:tab/>
         <w:t>- conserver une traçabilité complète des décisions</w:t>
       </w:r>
     </w:p>
     <w:p>
+      <w:pPr>
+        <w:jc w:val="both"/>
+      </w:pPr>
       <w:r>
         <w:tab/>
         <w:t>- réduire les oublis grâce aux relances et aux notifications par mail</w:t>
@@ -2942,7 +2975,7 @@
       <w:pPr>
         <w:pStyle w:val="Titre2"/>
       </w:pPr>
-      <w:bookmarkStart w:id="3" w:name="_Toc229386150"/>
+      <w:bookmarkStart w:id="3" w:name="_Toc229581941"/>
       <w:r>
         <w:lastRenderedPageBreak/>
         <w:t>Première connexion :</w:t>
@@ -2956,6 +2989,7 @@
           <w:ilvl w:val="0"/>
           <w:numId w:val="4"/>
         </w:numPr>
+        <w:jc w:val="both"/>
       </w:pPr>
       <w:r>
         <w:t xml:space="preserve">Ouvrir la page de connexion de GDAP : </w:t>
@@ -2976,6 +3010,7 @@
           <w:ilvl w:val="0"/>
           <w:numId w:val="4"/>
         </w:numPr>
+        <w:jc w:val="both"/>
       </w:pPr>
       <w:r>
         <w:rPr>
@@ -3060,6 +3095,7 @@
     <w:p>
       <w:pPr>
         <w:pStyle w:val="Paragraphedeliste"/>
+        <w:jc w:val="both"/>
       </w:pPr>
     </w:p>
     <w:p>
@@ -3069,6 +3105,7 @@
           <w:ilvl w:val="0"/>
           <w:numId w:val="4"/>
         </w:numPr>
+        <w:jc w:val="both"/>
       </w:pPr>
       <w:r>
         <w:t>Se connecter</w:t>
@@ -3077,11 +3114,13 @@
     <w:p>
       <w:pPr>
         <w:pStyle w:val="Paragraphedeliste"/>
-      </w:pPr>
-    </w:p>
-    <w:p>
-      <w:pPr>
-        <w:pStyle w:val="Paragraphedeliste"/>
+        <w:jc w:val="both"/>
+      </w:pPr>
+    </w:p>
+    <w:p>
+      <w:pPr>
+        <w:pStyle w:val="Paragraphedeliste"/>
+        <w:jc w:val="both"/>
       </w:pPr>
     </w:p>
     <w:p>
@@ -3091,6 +3130,7 @@
           <w:ilvl w:val="0"/>
           <w:numId w:val="4"/>
         </w:numPr>
+        <w:jc w:val="both"/>
       </w:pPr>
       <w:r>
         <w:t>Lors de la première connexion, il est obligatoire de changer le mot de passe. Le mot de passe doit contenir :</w:t>
@@ -3103,71 +3143,25 @@
           <w:ilvl w:val="1"/>
           <w:numId w:val="4"/>
         </w:numPr>
-      </w:pPr>
-      <w:r>
-        <w:t xml:space="preserve">Au moins 10 caractères, </w:t>
-      </w:r>
-    </w:p>
-    <w:p>
-      <w:pPr>
-        <w:pStyle w:val="Paragraphedeliste"/>
-        <w:numPr>
-          <w:ilvl w:val="1"/>
-          <w:numId w:val="4"/>
-        </w:numPr>
-      </w:pPr>
-      <w:r>
-        <w:t xml:space="preserve">une majuscule, </w:t>
-      </w:r>
-    </w:p>
-    <w:p>
-      <w:pPr>
-        <w:pStyle w:val="Paragraphedeliste"/>
-        <w:numPr>
-          <w:ilvl w:val="1"/>
-          <w:numId w:val="4"/>
-        </w:numPr>
-      </w:pPr>
-      <w:r>
-        <w:t xml:space="preserve">un chiffre </w:t>
-      </w:r>
-    </w:p>
-    <w:p>
-      <w:pPr>
-        <w:pStyle w:val="Paragraphedeliste"/>
-        <w:numPr>
-          <w:ilvl w:val="1"/>
-          <w:numId w:val="4"/>
-        </w:numPr>
-      </w:pPr>
-      <w:r>
-        <w:t>et un caractère spécial</w:t>
-      </w:r>
-    </w:p>
-    <w:p>
-      <w:r>
-        <w:br w:type="page"/>
-      </w:r>
-    </w:p>
-    <w:p>
+        <w:jc w:val="both"/>
+      </w:pPr>
       <w:r>
         <w:rPr>
           <w:noProof/>
         </w:rPr>
-        <w:lastRenderedPageBreak/>
         <w:drawing>
-          <wp:anchor distT="0" distB="0" distL="114300" distR="114300" simplePos="0" relativeHeight="251664384" behindDoc="0" locked="0" layoutInCell="1" allowOverlap="1" wp14:anchorId="4F122D17" wp14:editId="7432A6F4">
+          <wp:anchor distT="0" distB="0" distL="114300" distR="114300" simplePos="0" relativeHeight="251694080" behindDoc="0" locked="0" layoutInCell="1" allowOverlap="1" wp14:anchorId="1DF8DA7D" wp14:editId="35D8F2E9">
             <wp:simplePos x="0" y="0"/>
-            <wp:positionH relativeFrom="margin">
-              <wp:align>right</wp:align>
+            <wp:positionH relativeFrom="page">
+              <wp:posOffset>3048000</wp:posOffset>
             </wp:positionH>
             <wp:positionV relativeFrom="margin">
-              <wp:posOffset>4085</wp:posOffset>
+              <wp:posOffset>6196330</wp:posOffset>
             </wp:positionV>
-            <wp:extent cx="5356860" cy="3806190"/>
-            <wp:effectExtent l="190500" t="190500" r="186690" b="194310"/>
+            <wp:extent cx="3640455" cy="2586990"/>
+            <wp:effectExtent l="190500" t="190500" r="188595" b="194310"/>
             <wp:wrapSquare wrapText="bothSides"/>
-            <wp:docPr id="378038649" name="Image 1"/>
+            <wp:docPr id="1131174375" name="Image 1"/>
             <wp:cNvGraphicFramePr>
               <a:graphicFrameLocks xmlns:a="http://schemas.openxmlformats.org/drawingml/2006/main" noChangeAspect="1"/>
             </wp:cNvGraphicFramePr>
@@ -3194,7 +3188,7 @@
                   <pic:spPr bwMode="auto">
                     <a:xfrm>
                       <a:off x="0" y="0"/>
-                      <a:ext cx="5356860" cy="3806190"/>
+                      <a:ext cx="3640455" cy="2586990"/>
                     </a:xfrm>
                     <a:prstGeom prst="rect">
                       <a:avLst/>
@@ -3221,8 +3215,64 @@
             <wp14:sizeRelH relativeFrom="margin">
               <wp14:pctWidth>0</wp14:pctWidth>
             </wp14:sizeRelH>
+            <wp14:sizeRelV relativeFrom="margin">
+              <wp14:pctHeight>0</wp14:pctHeight>
+            </wp14:sizeRelV>
           </wp:anchor>
         </w:drawing>
+      </w:r>
+      <w:r>
+        <w:t>Au moins 1</w:t>
+      </w:r>
+      <w:r>
+        <w:t>2</w:t>
+      </w:r>
+      <w:r>
+        <w:t xml:space="preserve"> caractères, </w:t>
+      </w:r>
+    </w:p>
+    <w:p>
+      <w:pPr>
+        <w:pStyle w:val="Paragraphedeliste"/>
+        <w:numPr>
+          <w:ilvl w:val="1"/>
+          <w:numId w:val="4"/>
+        </w:numPr>
+        <w:jc w:val="both"/>
+      </w:pPr>
+      <w:r>
+        <w:t xml:space="preserve">une majuscule, </w:t>
+      </w:r>
+    </w:p>
+    <w:p>
+      <w:pPr>
+        <w:pStyle w:val="Paragraphedeliste"/>
+        <w:numPr>
+          <w:ilvl w:val="1"/>
+          <w:numId w:val="4"/>
+        </w:numPr>
+        <w:jc w:val="both"/>
+      </w:pPr>
+      <w:r>
+        <w:t xml:space="preserve">un chiffre </w:t>
+      </w:r>
+    </w:p>
+    <w:p>
+      <w:pPr>
+        <w:pStyle w:val="Paragraphedeliste"/>
+        <w:numPr>
+          <w:ilvl w:val="1"/>
+          <w:numId w:val="4"/>
+        </w:numPr>
+        <w:jc w:val="both"/>
+      </w:pPr>
+      <w:r>
+        <w:t>et un caractère spécial</w:t>
+      </w:r>
+    </w:p>
+    <w:p>
+      <w:r>
+        <w:br w:type="page"/>
       </w:r>
     </w:p>
     <w:p>
@@ -3237,14 +3287,15 @@
         <w:rPr>
           <w:noProof/>
         </w:rPr>
+        <w:lastRenderedPageBreak/>
         <w:drawing>
-          <wp:anchor distT="0" distB="0" distL="114300" distR="114300" simplePos="0" relativeHeight="251665408" behindDoc="0" locked="0" layoutInCell="1" allowOverlap="1" wp14:anchorId="122F4304" wp14:editId="3A2FC42F">
+          <wp:anchor distT="0" distB="0" distL="114300" distR="114300" simplePos="0" relativeHeight="251665408" behindDoc="0" locked="0" layoutInCell="1" allowOverlap="1" wp14:anchorId="122F4304" wp14:editId="55426CCA">
             <wp:simplePos x="0" y="0"/>
             <wp:positionH relativeFrom="margin">
-              <wp:align>center</wp:align>
+              <wp:posOffset>-11430</wp:posOffset>
             </wp:positionH>
             <wp:positionV relativeFrom="margin">
-              <wp:posOffset>5010066</wp:posOffset>
+              <wp:posOffset>636270</wp:posOffset>
             </wp:positionV>
             <wp:extent cx="5760720" cy="3225165"/>
             <wp:effectExtent l="190500" t="190500" r="182880" b="184785"/>
@@ -3306,9 +3357,8 @@
       <w:pPr>
         <w:pStyle w:val="Titre2"/>
       </w:pPr>
-      <w:bookmarkStart w:id="4" w:name="_Toc229386151"/>
-      <w:r>
-        <w:lastRenderedPageBreak/>
+      <w:bookmarkStart w:id="4" w:name="_Toc229581942"/>
+      <w:r>
         <w:t>La vue générale de l’interface :</w:t>
       </w:r>
       <w:bookmarkEnd w:id="4"/>
@@ -3322,48 +3372,21 @@
       </w:r>
     </w:p>
     <w:p>
-      <w:r>
-        <w:tab/>
-        <w:t>- Le tableau de bord</w:t>
-      </w:r>
-    </w:p>
-    <w:p>
-      <w:r>
-        <w:tab/>
-        <w:t>- Les dernières demandes</w:t>
-      </w:r>
-    </w:p>
-    <w:p>
-      <w:r>
-        <w:tab/>
-        <w:t>- Nouvelle demande</w:t>
-      </w:r>
-    </w:p>
-    <w:p>
-      <w:r>
-        <w:tab/>
-        <w:t>- Historique</w:t>
-      </w:r>
-    </w:p>
-    <w:p>
-      <w:r>
-        <w:tab/>
-        <w:t>- Administrateur (uniquement accessible par le compte admin)</w:t>
-      </w:r>
-    </w:p>
-    <w:p>
+      <w:pPr>
+        <w:jc w:val="both"/>
+      </w:pPr>
       <w:r>
         <w:rPr>
           <w:noProof/>
         </w:rPr>
         <w:drawing>
-          <wp:anchor distT="0" distB="0" distL="114300" distR="114300" simplePos="0" relativeHeight="251666432" behindDoc="0" locked="0" layoutInCell="1" allowOverlap="1" wp14:anchorId="3BDF686E" wp14:editId="10BA2C77">
+          <wp:anchor distT="0" distB="0" distL="114300" distR="114300" simplePos="0" relativeHeight="251666432" behindDoc="0" locked="0" layoutInCell="1" allowOverlap="1" wp14:anchorId="3BDF686E" wp14:editId="35B601F0">
             <wp:simplePos x="0" y="0"/>
             <wp:positionH relativeFrom="margin">
-              <wp:align>center</wp:align>
+              <wp:align>right</wp:align>
             </wp:positionH>
             <wp:positionV relativeFrom="margin">
-              <wp:posOffset>2420524</wp:posOffset>
+              <wp:posOffset>5210810</wp:posOffset>
             </wp:positionV>
             <wp:extent cx="2854325" cy="3341370"/>
             <wp:effectExtent l="190500" t="190500" r="193675" b="182880"/>
@@ -3428,19 +3451,64 @@
           </wp:anchor>
         </w:drawing>
       </w:r>
+      <w:r>
+        <w:tab/>
+        <w:t>- Le tableau de bord</w:t>
+      </w:r>
+    </w:p>
+    <w:p>
+      <w:pPr>
+        <w:jc w:val="both"/>
+      </w:pPr>
+      <w:r>
+        <w:tab/>
+        <w:t>- Les dernières demandes</w:t>
+      </w:r>
+    </w:p>
+    <w:p>
+      <w:pPr>
+        <w:jc w:val="both"/>
+      </w:pPr>
+      <w:r>
+        <w:tab/>
+        <w:t>- Nouvelle demande</w:t>
+      </w:r>
+    </w:p>
+    <w:p>
+      <w:pPr>
+        <w:jc w:val="both"/>
+      </w:pPr>
+      <w:r>
+        <w:tab/>
+        <w:t>- Historique</w:t>
+      </w:r>
+    </w:p>
+    <w:p>
+      <w:pPr>
+        <w:jc w:val="both"/>
+      </w:pPr>
+      <w:r>
+        <w:tab/>
+        <w:t>-</w:t>
+      </w:r>
+      <w:r>
+        <w:t xml:space="preserve"> </w:t>
+      </w:r>
+      <w:r>
+        <w:t>Administrateur</w:t>
+      </w:r>
+      <w:r>
+        <w:t xml:space="preserve"> </w:t>
+      </w:r>
+      <w:r>
+        <w:t>(uniquement accessible par le compte admin)</w:t>
+      </w:r>
     </w:p>
     <w:p/>
     <w:p/>
     <w:p/>
     <w:p/>
     <w:p/>
-    <w:p/>
-    <w:p/>
-    <w:p/>
-    <w:p/>
-    <w:p/>
-    <w:p/>
-    <w:p/>
     <w:p>
       <w:r>
         <w:br w:type="page"/>
@@ -3450,7 +3518,7 @@
       <w:pPr>
         <w:pStyle w:val="Titre2"/>
       </w:pPr>
-      <w:bookmarkStart w:id="5" w:name="_Toc229386152"/>
+      <w:bookmarkStart w:id="5" w:name="_Toc229581943"/>
       <w:r>
         <w:lastRenderedPageBreak/>
         <w:t>Le tableau de bord :</w:t>
@@ -3588,7 +3656,7 @@
       <w:pPr>
         <w:pStyle w:val="Titre2"/>
       </w:pPr>
-      <w:bookmarkStart w:id="6" w:name="_Toc229386153"/>
+      <w:bookmarkStart w:id="6" w:name="_Toc229581944"/>
       <w:r>
         <w:t>La terminologie des différents statuts :</w:t>
       </w:r>
@@ -3601,6 +3669,7 @@
           <w:ilvl w:val="0"/>
           <w:numId w:val="7"/>
         </w:numPr>
+        <w:jc w:val="both"/>
       </w:pPr>
       <w:r>
         <w:rPr>
@@ -3625,6 +3694,7 @@
           <w:ilvl w:val="0"/>
           <w:numId w:val="7"/>
         </w:numPr>
+        <w:jc w:val="both"/>
       </w:pPr>
       <w:r>
         <w:rPr>
@@ -3643,6 +3713,7 @@
           <w:ilvl w:val="0"/>
           <w:numId w:val="7"/>
         </w:numPr>
+        <w:jc w:val="both"/>
       </w:pPr>
       <w:r>
         <w:rPr>
@@ -3661,6 +3732,7 @@
           <w:ilvl w:val="0"/>
           <w:numId w:val="7"/>
         </w:numPr>
+        <w:jc w:val="both"/>
       </w:pPr>
       <w:r>
         <w:rPr>
@@ -3673,6 +3745,13 @@
       </w:r>
     </w:p>
     <w:p>
+      <w:pPr>
+        <w:pStyle w:val="Paragraphedeliste"/>
+        <w:ind w:left="1416"/>
+        <w:jc w:val="both"/>
+      </w:pPr>
+    </w:p>
+    <w:p>
       <w:r>
         <w:br w:type="page"/>
       </w:r>
@@ -3681,7 +3760,7 @@
       <w:pPr>
         <w:pStyle w:val="Titre2"/>
       </w:pPr>
-      <w:bookmarkStart w:id="7" w:name="_Toc229386154"/>
+      <w:bookmarkStart w:id="7" w:name="_Toc229581945"/>
       <w:r>
         <w:lastRenderedPageBreak/>
         <w:t>Guide pour les comptes utilisateurs :</w:t>
@@ -3689,6 +3768,9 @@
       <w:bookmarkEnd w:id="7"/>
     </w:p>
     <w:p>
+      <w:pPr>
+        <w:jc w:val="both"/>
+      </w:pPr>
       <w:r>
         <w:t>Dans cette section, un guide est proposé pour les différents cas d’utilisation de l’application (création, suivi, validation) :</w:t>
       </w:r>
@@ -3701,7 +3783,7 @@
           <w:u w:val="single"/>
         </w:rPr>
       </w:pPr>
-      <w:bookmarkStart w:id="8" w:name="_Toc229386155"/>
+      <w:bookmarkStart w:id="8" w:name="_Toc229581946"/>
       <w:r>
         <w:rPr>
           <w:u w:val="single"/>
@@ -3717,6 +3799,7 @@
           <w:ilvl w:val="0"/>
           <w:numId w:val="8"/>
         </w:numPr>
+        <w:jc w:val="both"/>
       </w:pPr>
       <w:r>
         <w:t>Ouvrir la page Dernières demandes</w:t>
@@ -3729,6 +3812,7 @@
           <w:ilvl w:val="0"/>
           <w:numId w:val="8"/>
         </w:numPr>
+        <w:jc w:val="both"/>
       </w:pPr>
       <w:r>
         <w:t>Utiliser les filtres si besoin :</w:t>
@@ -3741,6 +3825,7 @@
           <w:ilvl w:val="1"/>
           <w:numId w:val="8"/>
         </w:numPr>
+        <w:jc w:val="both"/>
       </w:pPr>
       <w:r>
         <w:t>Statut</w:t>
@@ -3753,6 +3838,7 @@
           <w:ilvl w:val="1"/>
           <w:numId w:val="8"/>
         </w:numPr>
+        <w:jc w:val="both"/>
       </w:pPr>
       <w:r>
         <w:t>Service</w:t>
@@ -3765,6 +3851,7 @@
           <w:ilvl w:val="1"/>
           <w:numId w:val="8"/>
         </w:numPr>
+        <w:jc w:val="both"/>
       </w:pPr>
       <w:r>
         <w:t>Type</w:t>
@@ -3777,6 +3864,7 @@
           <w:ilvl w:val="1"/>
           <w:numId w:val="8"/>
         </w:numPr>
+        <w:jc w:val="both"/>
       </w:pPr>
       <w:r>
         <w:t>Agent</w:t>
@@ -3789,6 +3877,7 @@
           <w:ilvl w:val="1"/>
           <w:numId w:val="8"/>
         </w:numPr>
+        <w:jc w:val="both"/>
       </w:pPr>
       <w:r>
         <w:t>Date d’arrivée</w:t>
@@ -3801,6 +3890,7 @@
           <w:ilvl w:val="1"/>
           <w:numId w:val="8"/>
         </w:numPr>
+        <w:jc w:val="both"/>
       </w:pPr>
       <w:r>
         <w:t>Date de départ</w:t>
@@ -3813,6 +3903,7 @@
           <w:ilvl w:val="0"/>
           <w:numId w:val="8"/>
         </w:numPr>
+        <w:jc w:val="both"/>
       </w:pPr>
       <w:r>
         <w:rPr>
@@ -3959,7 +4050,7 @@
           <w:u w:val="single"/>
         </w:rPr>
       </w:pPr>
-      <w:bookmarkStart w:id="9" w:name="_Toc229386156"/>
+      <w:bookmarkStart w:id="9" w:name="_Toc229581947"/>
       <w:r>
         <w:rPr>
           <w:u w:val="single"/>
@@ -3975,6 +4066,7 @@
           <w:ilvl w:val="0"/>
           <w:numId w:val="9"/>
         </w:numPr>
+        <w:jc w:val="both"/>
       </w:pPr>
       <w:r>
         <w:t>Ouvrir la page Dernière demandes ou historique</w:t>
@@ -3987,6 +4079,7 @@
           <w:ilvl w:val="0"/>
           <w:numId w:val="9"/>
         </w:numPr>
+        <w:jc w:val="both"/>
       </w:pPr>
       <w:r>
         <w:t>Appliquer les filtres souhaités (les filtres sont optionnels)</w:t>
@@ -3995,6 +4088,7 @@
     <w:p>
       <w:pPr>
         <w:pStyle w:val="Paragraphedeliste"/>
+        <w:jc w:val="both"/>
       </w:pPr>
       <w:r>
         <w:rPr>
@@ -4064,6 +4158,7 @@
           <w:ilvl w:val="0"/>
           <w:numId w:val="9"/>
         </w:numPr>
+        <w:jc w:val="both"/>
       </w:pPr>
       <w:r>
         <w:t>Cliquer sur le bouton d’export XLS ( )</w:t>
@@ -4075,6 +4170,7 @@
     <w:p>
       <w:pPr>
         <w:pStyle w:val="Paragraphedeliste"/>
+        <w:jc w:val="both"/>
       </w:pPr>
     </w:p>
     <w:p>
@@ -4084,24 +4180,25 @@
           <w:ilvl w:val="0"/>
           <w:numId w:val="9"/>
         </w:numPr>
+        <w:jc w:val="both"/>
       </w:pPr>
       <w:r>
         <w:rPr>
           <w:noProof/>
         </w:rPr>
         <w:drawing>
-          <wp:anchor distT="0" distB="0" distL="114300" distR="114300" simplePos="0" relativeHeight="251671552" behindDoc="0" locked="0" layoutInCell="1" allowOverlap="1" wp14:anchorId="452E9805" wp14:editId="42505484">
+          <wp:anchor distT="0" distB="0" distL="114300" distR="114300" simplePos="0" relativeHeight="251670528" behindDoc="0" locked="0" layoutInCell="1" allowOverlap="1" wp14:anchorId="678D9D20" wp14:editId="7C382D67">
             <wp:simplePos x="0" y="0"/>
             <wp:positionH relativeFrom="page">
-              <wp:posOffset>123825</wp:posOffset>
+              <wp:posOffset>438150</wp:posOffset>
             </wp:positionH>
             <wp:positionV relativeFrom="margin">
-              <wp:posOffset>2663825</wp:posOffset>
+              <wp:posOffset>3034030</wp:posOffset>
             </wp:positionV>
-            <wp:extent cx="7306310" cy="523875"/>
-            <wp:effectExtent l="190500" t="190500" r="199390" b="200025"/>
+            <wp:extent cx="6686550" cy="123190"/>
+            <wp:effectExtent l="171450" t="190500" r="152400" b="181610"/>
             <wp:wrapSquare wrapText="bothSides"/>
-            <wp:docPr id="1517657962" name="Image 1"/>
+            <wp:docPr id="1008607017" name="Image 1"/>
             <wp:cNvGraphicFramePr>
               <a:graphicFrameLocks xmlns:a="http://schemas.openxmlformats.org/drawingml/2006/main" noChangeAspect="1"/>
             </wp:cNvGraphicFramePr>
@@ -4109,18 +4206,18 @@
               <a:graphicData uri="http://schemas.openxmlformats.org/drawingml/2006/picture">
                 <pic:pic xmlns:pic="http://schemas.openxmlformats.org/drawingml/2006/picture">
                   <pic:nvPicPr>
-                    <pic:cNvPr id="1517657962" name=""/>
+                    <pic:cNvPr id="1008607017" name=""/>
                     <pic:cNvPicPr/>
                   </pic:nvPicPr>
                   <pic:blipFill rotWithShape="1">
-                    <a:blip r:embed="rId18">
+                    <a:blip r:embed="rId18" cstate="print">
                       <a:extLst>
                         <a:ext uri="{28A0092B-C50C-407E-A947-70E740481C1C}">
                           <a14:useLocalDpi xmlns:a14="http://schemas.microsoft.com/office/drawing/2010/main" val="0"/>
                         </a:ext>
                       </a:extLst>
                     </a:blip>
-                    <a:srcRect b="86384"/>
+                    <a:srcRect t="96447"/>
                     <a:stretch>
                       <a:fillRect/>
                     </a:stretch>
@@ -4128,7 +4225,7 @@
                   <pic:spPr bwMode="auto">
                     <a:xfrm>
                       <a:off x="0" y="0"/>
-                      <a:ext cx="7306310" cy="523875"/>
+                      <a:ext cx="6686550" cy="123190"/>
                     </a:xfrm>
                     <a:prstGeom prst="rect">
                       <a:avLst/>
@@ -4166,18 +4263,18 @@
           <w:noProof/>
         </w:rPr>
         <w:drawing>
-          <wp:anchor distT="0" distB="0" distL="114300" distR="114300" simplePos="0" relativeHeight="251670528" behindDoc="0" locked="0" layoutInCell="1" allowOverlap="1" wp14:anchorId="678D9D20" wp14:editId="71FEBA57">
+          <wp:anchor distT="0" distB="0" distL="114300" distR="114300" simplePos="0" relativeHeight="251671552" behindDoc="0" locked="0" layoutInCell="1" allowOverlap="1" wp14:anchorId="452E9805" wp14:editId="53FF1792">
             <wp:simplePos x="0" y="0"/>
             <wp:positionH relativeFrom="page">
-              <wp:posOffset>130810</wp:posOffset>
+              <wp:posOffset>428625</wp:posOffset>
             </wp:positionH>
             <wp:positionV relativeFrom="margin">
-              <wp:posOffset>3224159</wp:posOffset>
+              <wp:posOffset>2538730</wp:posOffset>
             </wp:positionV>
-            <wp:extent cx="7280275" cy="134620"/>
-            <wp:effectExtent l="171450" t="190500" r="149225" b="189230"/>
+            <wp:extent cx="6709606" cy="481091"/>
+            <wp:effectExtent l="190500" t="190500" r="186690" b="186055"/>
             <wp:wrapSquare wrapText="bothSides"/>
-            <wp:docPr id="1008607017" name="Image 1"/>
+            <wp:docPr id="1517657962" name="Image 1"/>
             <wp:cNvGraphicFramePr>
               <a:graphicFrameLocks xmlns:a="http://schemas.openxmlformats.org/drawingml/2006/main" noChangeAspect="1"/>
             </wp:cNvGraphicFramePr>
@@ -4185,18 +4282,18 @@
               <a:graphicData uri="http://schemas.openxmlformats.org/drawingml/2006/picture">
                 <pic:pic xmlns:pic="http://schemas.openxmlformats.org/drawingml/2006/picture">
                   <pic:nvPicPr>
-                    <pic:cNvPr id="1008607017" name=""/>
+                    <pic:cNvPr id="1517657962" name=""/>
                     <pic:cNvPicPr/>
                   </pic:nvPicPr>
                   <pic:blipFill rotWithShape="1">
-                    <a:blip r:embed="rId18">
+                    <a:blip r:embed="rId18" cstate="print">
                       <a:extLst>
                         <a:ext uri="{28A0092B-C50C-407E-A947-70E740481C1C}">
                           <a14:useLocalDpi xmlns:a14="http://schemas.microsoft.com/office/drawing/2010/main" val="0"/>
                         </a:ext>
                       </a:extLst>
                     </a:blip>
-                    <a:srcRect t="96447"/>
+                    <a:srcRect b="86384"/>
                     <a:stretch>
                       <a:fillRect/>
                     </a:stretch>
@@ -4204,7 +4301,7 @@
                   <pic:spPr bwMode="auto">
                     <a:xfrm>
                       <a:off x="0" y="0"/>
-                      <a:ext cx="7280275" cy="134620"/>
+                      <a:ext cx="6709606" cy="481091"/>
                     </a:xfrm>
                     <a:prstGeom prst="rect">
                       <a:avLst/>
@@ -4238,7 +4335,13 @@
         </w:drawing>
       </w:r>
       <w:r>
-        <w:t>Puis consulter le fichier télécharger. Il contient deux pages. La seconde page contient plus de détail sur les différentes demandes, notamment l’historique. Différents filtres sont applicables.</w:t>
+        <w:t xml:space="preserve"> </w:t>
+      </w:r>
+      <w:r>
+        <w:t>Puis consulter le fichier téléchargé. Il contient deux pages. La seconde page contient plus de détails sur les différentes demandes, notamment l’historique. Différents filtres sont applicables</w:t>
+      </w:r>
+      <w:r>
+        <w:t>.</w:t>
       </w:r>
     </w:p>
     <w:p>
@@ -4270,7 +4373,7 @@
           <w:u w:val="single"/>
         </w:rPr>
       </w:pPr>
-      <w:bookmarkStart w:id="10" w:name="_Toc229386157"/>
+      <w:bookmarkStart w:id="10" w:name="_Toc229581948"/>
       <w:r>
         <w:rPr>
           <w:u w:val="single"/>
@@ -4569,7 +4672,7 @@
         </w:rPr>
         <w:lastRenderedPageBreak/>
         <w:drawing>
-          <wp:anchor distT="0" distB="0" distL="114300" distR="114300" simplePos="0" relativeHeight="251674624" behindDoc="0" locked="0" layoutInCell="1" allowOverlap="1" wp14:anchorId="7EFEB34C" wp14:editId="1BB60574">
+          <wp:anchor distT="0" distB="0" distL="114300" distR="114300" simplePos="0" relativeHeight="251674624" behindDoc="0" locked="0" layoutInCell="1" allowOverlap="1" wp14:anchorId="7EFEB34C" wp14:editId="631AB6F9">
             <wp:simplePos x="0" y="0"/>
             <wp:positionH relativeFrom="margin">
               <wp:align>center</wp:align>
@@ -4641,7 +4744,140 @@
         <w:rPr>
           <w:noProof/>
         </w:rPr>
-        <w:t xml:space="preserve"> </w:t>
+        <w:t xml:space="preserve">. </w:t>
+      </w:r>
+    </w:p>
+    <w:p>
+      <w:pPr>
+        <w:pStyle w:val="Paragraphedeliste"/>
+        <w:jc w:val="both"/>
+      </w:pPr>
+      <w:r>
+        <w:rPr>
+          <w:i/>
+          <w:iCs/>
+          <w:noProof/>
+          <w:u w:val="single"/>
+        </w:rPr>
+        <w:t>PS</w:t>
+      </w:r>
+      <w:r>
+        <w:rPr>
+          <w:noProof/>
+        </w:rPr>
+        <w:t xml:space="preserve"> : </w:t>
+      </w:r>
+      <w:r>
+        <w:rPr>
+          <w:noProof/>
+        </w:rPr>
+        <w:t>Si le service technique est à l’initiative de la création de la demande, il a la possibilité de compléter deux éléments :</w:t>
+      </w:r>
+    </w:p>
+    <w:p>
+      <w:pPr>
+        <w:pStyle w:val="Paragraphedeliste"/>
+        <w:numPr>
+          <w:ilvl w:val="1"/>
+          <w:numId w:val="10"/>
+        </w:numPr>
+        <w:jc w:val="both"/>
+      </w:pPr>
+      <w:r>
+        <w:rPr>
+          <w:noProof/>
+        </w:rPr>
+        <w:drawing>
+          <wp:anchor distT="0" distB="0" distL="114300" distR="114300" simplePos="0" relativeHeight="251689984" behindDoc="0" locked="0" layoutInCell="1" allowOverlap="1" wp14:anchorId="7D231C6A" wp14:editId="28233484">
+            <wp:simplePos x="0" y="0"/>
+            <wp:positionH relativeFrom="margin">
+              <wp:posOffset>70485</wp:posOffset>
+            </wp:positionH>
+            <wp:positionV relativeFrom="margin">
+              <wp:posOffset>6741795</wp:posOffset>
+            </wp:positionV>
+            <wp:extent cx="5760720" cy="2393950"/>
+            <wp:effectExtent l="190500" t="190500" r="182880" b="196850"/>
+            <wp:wrapSquare wrapText="bothSides"/>
+            <wp:docPr id="1181589782" name="Image 1"/>
+            <wp:cNvGraphicFramePr>
+              <a:graphicFrameLocks xmlns:a="http://schemas.openxmlformats.org/drawingml/2006/main" noChangeAspect="1"/>
+            </wp:cNvGraphicFramePr>
+            <a:graphic xmlns:a="http://schemas.openxmlformats.org/drawingml/2006/main">
+              <a:graphicData uri="http://schemas.openxmlformats.org/drawingml/2006/picture">
+                <pic:pic xmlns:pic="http://schemas.openxmlformats.org/drawingml/2006/picture">
+                  <pic:nvPicPr>
+                    <pic:cNvPr id="1181589782" name=""/>
+                    <pic:cNvPicPr/>
+                  </pic:nvPicPr>
+                  <pic:blipFill>
+                    <a:blip r:embed="rId22">
+                      <a:extLst>
+                        <a:ext uri="{28A0092B-C50C-407E-A947-70E740481C1C}">
+                          <a14:useLocalDpi xmlns:a14="http://schemas.microsoft.com/office/drawing/2010/main" val="0"/>
+                        </a:ext>
+                      </a:extLst>
+                    </a:blip>
+                    <a:stretch>
+                      <a:fillRect/>
+                    </a:stretch>
+                  </pic:blipFill>
+                  <pic:spPr>
+                    <a:xfrm>
+                      <a:off x="0" y="0"/>
+                      <a:ext cx="5760720" cy="2393950"/>
+                    </a:xfrm>
+                    <a:prstGeom prst="rect">
+                      <a:avLst/>
+                    </a:prstGeom>
+                    <a:ln>
+                      <a:noFill/>
+                    </a:ln>
+                    <a:effectLst>
+                      <a:outerShdw blurRad="190500" algn="tl" rotWithShape="0">
+                        <a:srgbClr val="000000">
+                          <a:alpha val="70000"/>
+                        </a:srgbClr>
+                      </a:outerShdw>
+                    </a:effectLst>
+                  </pic:spPr>
+                </pic:pic>
+              </a:graphicData>
+            </a:graphic>
+          </wp:anchor>
+        </w:drawing>
+      </w:r>
+      <w:r>
+        <w:rPr>
+          <w:noProof/>
+        </w:rPr>
+        <w:t>La taille des EPI (vêtements et chaussures)</w:t>
+      </w:r>
+    </w:p>
+    <w:p>
+      <w:pPr>
+        <w:pStyle w:val="Paragraphedeliste"/>
+        <w:numPr>
+          <w:ilvl w:val="1"/>
+          <w:numId w:val="10"/>
+        </w:numPr>
+        <w:jc w:val="both"/>
+      </w:pPr>
+      <w:r>
+        <w:rPr>
+          <w:noProof/>
+        </w:rPr>
+        <w:t>Le matériel propre au service technique</w:t>
+      </w:r>
+    </w:p>
+    <w:p>
+      <w:pPr>
+        <w:ind w:left="708"/>
+        <w:jc w:val="both"/>
+      </w:pPr>
+      <w:r>
+        <w:lastRenderedPageBreak/>
+        <w:t>Sinon, il pourra modifier ces paramètres au moment de la validation de la demande.</w:t>
       </w:r>
     </w:p>
     <w:p>
@@ -4653,6 +4889,70 @@
         </w:numPr>
       </w:pPr>
       <w:r>
+        <w:rPr>
+          <w:noProof/>
+        </w:rPr>
+        <w:drawing>
+          <wp:anchor distT="0" distB="0" distL="114300" distR="114300" simplePos="0" relativeHeight="251691008" behindDoc="0" locked="0" layoutInCell="1" allowOverlap="1" wp14:anchorId="00254B1B" wp14:editId="592EE676">
+            <wp:simplePos x="0" y="0"/>
+            <wp:positionH relativeFrom="margin">
+              <wp:align>center</wp:align>
+            </wp:positionH>
+            <wp:positionV relativeFrom="margin">
+              <wp:posOffset>760095</wp:posOffset>
+            </wp:positionV>
+            <wp:extent cx="5760720" cy="1394460"/>
+            <wp:effectExtent l="190500" t="190500" r="182880" b="186690"/>
+            <wp:wrapSquare wrapText="bothSides"/>
+            <wp:docPr id="1154867628" name="Image 1"/>
+            <wp:cNvGraphicFramePr>
+              <a:graphicFrameLocks xmlns:a="http://schemas.openxmlformats.org/drawingml/2006/main" noChangeAspect="1"/>
+            </wp:cNvGraphicFramePr>
+            <a:graphic xmlns:a="http://schemas.openxmlformats.org/drawingml/2006/main">
+              <a:graphicData uri="http://schemas.openxmlformats.org/drawingml/2006/picture">
+                <pic:pic xmlns:pic="http://schemas.openxmlformats.org/drawingml/2006/picture">
+                  <pic:nvPicPr>
+                    <pic:cNvPr id="1154867628" name=""/>
+                    <pic:cNvPicPr/>
+                  </pic:nvPicPr>
+                  <pic:blipFill>
+                    <a:blip r:embed="rId23">
+                      <a:extLst>
+                        <a:ext uri="{28A0092B-C50C-407E-A947-70E740481C1C}">
+                          <a14:useLocalDpi xmlns:a14="http://schemas.microsoft.com/office/drawing/2010/main" val="0"/>
+                        </a:ext>
+                      </a:extLst>
+                    </a:blip>
+                    <a:stretch>
+                      <a:fillRect/>
+                    </a:stretch>
+                  </pic:blipFill>
+                  <pic:spPr>
+                    <a:xfrm>
+                      <a:off x="0" y="0"/>
+                      <a:ext cx="5760720" cy="1394460"/>
+                    </a:xfrm>
+                    <a:prstGeom prst="rect">
+                      <a:avLst/>
+                    </a:prstGeom>
+                    <a:ln>
+                      <a:noFill/>
+                    </a:ln>
+                    <a:effectLst>
+                      <a:outerShdw blurRad="190500" algn="tl" rotWithShape="0">
+                        <a:srgbClr val="000000">
+                          <a:alpha val="70000"/>
+                        </a:srgbClr>
+                      </a:outerShdw>
+                    </a:effectLst>
+                  </pic:spPr>
+                </pic:pic>
+              </a:graphicData>
+            </a:graphic>
+          </wp:anchor>
+        </w:drawing>
+      </w:r>
+      <w:r>
         <w:t>Ajouter un commentaire obligatoire</w:t>
       </w:r>
     </w:p>
@@ -4675,6 +4975,70 @@
     </w:p>
     <w:p>
       <w:r>
+        <w:rPr>
+          <w:noProof/>
+        </w:rPr>
+        <w:drawing>
+          <wp:anchor distT="0" distB="0" distL="114300" distR="114300" simplePos="0" relativeHeight="251692032" behindDoc="0" locked="0" layoutInCell="1" allowOverlap="1" wp14:anchorId="5AB29E9D" wp14:editId="664ADB37">
+            <wp:simplePos x="0" y="0"/>
+            <wp:positionH relativeFrom="margin">
+              <wp:posOffset>232410</wp:posOffset>
+            </wp:positionH>
+            <wp:positionV relativeFrom="margin">
+              <wp:posOffset>2941320</wp:posOffset>
+            </wp:positionV>
+            <wp:extent cx="1809750" cy="542925"/>
+            <wp:effectExtent l="190500" t="190500" r="190500" b="200025"/>
+            <wp:wrapSquare wrapText="bothSides"/>
+            <wp:docPr id="988159644" name="Image 1"/>
+            <wp:cNvGraphicFramePr>
+              <a:graphicFrameLocks xmlns:a="http://schemas.openxmlformats.org/drawingml/2006/main" noChangeAspect="1"/>
+            </wp:cNvGraphicFramePr>
+            <a:graphic xmlns:a="http://schemas.openxmlformats.org/drawingml/2006/main">
+              <a:graphicData uri="http://schemas.openxmlformats.org/drawingml/2006/picture">
+                <pic:pic xmlns:pic="http://schemas.openxmlformats.org/drawingml/2006/picture">
+                  <pic:nvPicPr>
+                    <pic:cNvPr id="988159644" name=""/>
+                    <pic:cNvPicPr/>
+                  </pic:nvPicPr>
+                  <pic:blipFill>
+                    <a:blip r:embed="rId24">
+                      <a:extLst>
+                        <a:ext uri="{28A0092B-C50C-407E-A947-70E740481C1C}">
+                          <a14:useLocalDpi xmlns:a14="http://schemas.microsoft.com/office/drawing/2010/main" val="0"/>
+                        </a:ext>
+                      </a:extLst>
+                    </a:blip>
+                    <a:stretch>
+                      <a:fillRect/>
+                    </a:stretch>
+                  </pic:blipFill>
+                  <pic:spPr>
+                    <a:xfrm>
+                      <a:off x="0" y="0"/>
+                      <a:ext cx="1809750" cy="542925"/>
+                    </a:xfrm>
+                    <a:prstGeom prst="rect">
+                      <a:avLst/>
+                    </a:prstGeom>
+                    <a:ln>
+                      <a:noFill/>
+                    </a:ln>
+                    <a:effectLst>
+                      <a:outerShdw blurRad="190500" algn="tl" rotWithShape="0">
+                        <a:srgbClr val="000000">
+                          <a:alpha val="70000"/>
+                        </a:srgbClr>
+                      </a:outerShdw>
+                    </a:effectLst>
+                  </pic:spPr>
+                </pic:pic>
+              </a:graphicData>
+            </a:graphic>
+          </wp:anchor>
+        </w:drawing>
+      </w:r>
+      <w:r>
         <w:br w:type="page"/>
       </w:r>
     </w:p>
@@ -4685,7 +5049,7 @@
           <w:u w:val="single"/>
         </w:rPr>
       </w:pPr>
-      <w:bookmarkStart w:id="11" w:name="_Toc229386158"/>
+      <w:bookmarkStart w:id="11" w:name="_Toc229581949"/>
       <w:r>
         <w:rPr>
           <w:u w:val="single"/>
@@ -4756,7 +5120,7 @@
           <w:u w:val="single"/>
         </w:rPr>
       </w:pPr>
-      <w:bookmarkStart w:id="12" w:name="_Toc229386159"/>
+      <w:bookmarkStart w:id="12" w:name="_Toc229581950"/>
       <w:r>
         <w:rPr>
           <w:u w:val="single"/>
@@ -4818,7 +5182,7 @@
                     <pic:cNvPicPr/>
                   </pic:nvPicPr>
                   <pic:blipFill>
-                    <a:blip r:embed="rId22">
+                    <a:blip r:embed="rId25">
                       <a:extLst>
                         <a:ext uri="{28A0092B-C50C-407E-A947-70E740481C1C}">
                           <a14:useLocalDpi xmlns:a14="http://schemas.microsoft.com/office/drawing/2010/main" val="0"/>
@@ -4916,7 +5280,7 @@
           <w:u w:val="single"/>
         </w:rPr>
       </w:pPr>
-      <w:bookmarkStart w:id="13" w:name="_Toc229386160"/>
+      <w:bookmarkStart w:id="13" w:name="_Toc229581951"/>
       <w:r>
         <w:rPr>
           <w:u w:val="single"/>
@@ -5017,7 +5381,7 @@
           <w:u w:val="single"/>
         </w:rPr>
       </w:pPr>
-      <w:bookmarkStart w:id="14" w:name="_Toc229386161"/>
+      <w:bookmarkStart w:id="14" w:name="_Toc229581952"/>
       <w:r>
         <w:rPr>
           <w:u w:val="single"/>
@@ -5080,7 +5444,7 @@
                     <pic:cNvPicPr/>
                   </pic:nvPicPr>
                   <pic:blipFill>
-                    <a:blip r:embed="rId23">
+                    <a:blip r:embed="rId26">
                       <a:extLst>
                         <a:ext uri="{28A0092B-C50C-407E-A947-70E740481C1C}">
                           <a14:useLocalDpi xmlns:a14="http://schemas.microsoft.com/office/drawing/2010/main" val="0"/>
@@ -5145,7 +5509,7 @@
           <w:noProof/>
         </w:rPr>
         <w:drawing>
-          <wp:anchor distT="0" distB="0" distL="114300" distR="114300" simplePos="0" relativeHeight="251677696" behindDoc="0" locked="0" layoutInCell="1" allowOverlap="1" wp14:anchorId="5E88CEEE" wp14:editId="42C58ED2">
+          <wp:anchor distT="0" distB="0" distL="114300" distR="114300" simplePos="0" relativeHeight="251677696" behindDoc="0" locked="0" layoutInCell="1" allowOverlap="1" wp14:anchorId="5E88CEEE" wp14:editId="02D16C5C">
             <wp:simplePos x="0" y="0"/>
             <wp:positionH relativeFrom="margin">
               <wp:align>center</wp:align>
@@ -5168,7 +5532,7 @@
                     <pic:cNvPicPr/>
                   </pic:nvPicPr>
                   <pic:blipFill>
-                    <a:blip r:embed="rId24">
+                    <a:blip r:embed="rId27">
                       <a:extLst>
                         <a:ext uri="{28A0092B-C50C-407E-A947-70E740481C1C}">
                           <a14:useLocalDpi xmlns:a14="http://schemas.microsoft.com/office/drawing/2010/main" val="0"/>
@@ -5233,7 +5597,7 @@
           <w:u w:val="single"/>
         </w:rPr>
       </w:pPr>
-      <w:bookmarkStart w:id="15" w:name="_Toc229386162"/>
+      <w:bookmarkStart w:id="15" w:name="_Toc229581953"/>
       <w:r>
         <w:rPr>
           <w:u w:val="single"/>
@@ -5244,14 +5608,11 @@
       <w:bookmarkEnd w:id="15"/>
     </w:p>
     <w:p>
-      <w:r>
-        <w:t>Votre compte possède le role de validation en fonction du service auquel vous êtes rattaché. En fonction de l’action actuel à réaliser, vous pourrez ou non valid</w:t>
-      </w:r>
-      <w:r>
-        <w:t>er</w:t>
-      </w:r>
-      <w:r>
-        <w:t xml:space="preserve"> l’étape de la demande sur laquelle vous vous trouver.</w:t>
+      <w:pPr>
+        <w:jc w:val="both"/>
+      </w:pPr>
+      <w:r>
+        <w:t>Votre compte possède le rôle de validation en fonction du service auquel vous êtes rattaché. En fonction de l’action actuelle à réaliser, vous pourrez ou non valider l’étape de la demande sur laquelle vous vous trouvez.</w:t>
       </w:r>
     </w:p>
     <w:p>
@@ -5274,9 +5635,13 @@
           <w:ilvl w:val="0"/>
           <w:numId w:val="15"/>
         </w:numPr>
+        <w:jc w:val="both"/>
       </w:pPr>
       <w:r>
         <w:t>Ouvrez le détail d’une demande</w:t>
+      </w:r>
+      <w:r>
+        <w:t>.</w:t>
       </w:r>
     </w:p>
     <w:p>
@@ -5286,33 +5651,205 @@
           <w:ilvl w:val="0"/>
           <w:numId w:val="15"/>
         </w:numPr>
-      </w:pPr>
-      <w:r>
-        <w:t>Cliquer sur valider la demande (en bas de page)</w:t>
-      </w:r>
+        <w:jc w:val="both"/>
+      </w:pPr>
       <w:r>
         <w:rPr>
           <w:noProof/>
         </w:rPr>
-        <w:t xml:space="preserve"> </w:t>
-      </w:r>
-    </w:p>
-    <w:p>
-      <w:pPr>
-        <w:pStyle w:val="Paragraphedeliste"/>
-      </w:pPr>
-      <w:r>
-        <w:rPr>
-          <w:noProof/>
-        </w:rPr>
         <w:drawing>
-          <wp:anchor distT="0" distB="0" distL="114300" distR="114300" simplePos="0" relativeHeight="251678720" behindDoc="0" locked="0" layoutInCell="1" allowOverlap="1" wp14:anchorId="62970568" wp14:editId="019405F6">
+          <wp:anchor distT="0" distB="0" distL="114300" distR="114300" simplePos="0" relativeHeight="251687936" behindDoc="0" locked="0" layoutInCell="1" allowOverlap="1" wp14:anchorId="29EA5D45" wp14:editId="789DACE7">
             <wp:simplePos x="0" y="0"/>
             <wp:positionH relativeFrom="margin">
-              <wp:posOffset>618838</wp:posOffset>
+              <wp:posOffset>137160</wp:posOffset>
+            </wp:positionH>
+            <wp:positionV relativeFrom="page">
+              <wp:posOffset>3105150</wp:posOffset>
+            </wp:positionV>
+            <wp:extent cx="5760720" cy="4092575"/>
+            <wp:effectExtent l="190500" t="190500" r="182880" b="193675"/>
+            <wp:wrapSquare wrapText="bothSides"/>
+            <wp:docPr id="1899412120" name="Image 1"/>
+            <wp:cNvGraphicFramePr>
+              <a:graphicFrameLocks xmlns:a="http://schemas.openxmlformats.org/drawingml/2006/main" noChangeAspect="1"/>
+            </wp:cNvGraphicFramePr>
+            <a:graphic xmlns:a="http://schemas.openxmlformats.org/drawingml/2006/main">
+              <a:graphicData uri="http://schemas.openxmlformats.org/drawingml/2006/picture">
+                <pic:pic xmlns:pic="http://schemas.openxmlformats.org/drawingml/2006/picture">
+                  <pic:nvPicPr>
+                    <pic:cNvPr id="1899412120" name=""/>
+                    <pic:cNvPicPr/>
+                  </pic:nvPicPr>
+                  <pic:blipFill>
+                    <a:blip r:embed="rId28" cstate="print">
+                      <a:extLst>
+                        <a:ext uri="{28A0092B-C50C-407E-A947-70E740481C1C}">
+                          <a14:useLocalDpi xmlns:a14="http://schemas.microsoft.com/office/drawing/2010/main" val="0"/>
+                        </a:ext>
+                      </a:extLst>
+                    </a:blip>
+                    <a:stretch>
+                      <a:fillRect/>
+                    </a:stretch>
+                  </pic:blipFill>
+                  <pic:spPr>
+                    <a:xfrm>
+                      <a:off x="0" y="0"/>
+                      <a:ext cx="5760720" cy="4092575"/>
+                    </a:xfrm>
+                    <a:prstGeom prst="rect">
+                      <a:avLst/>
+                    </a:prstGeom>
+                    <a:ln>
+                      <a:noFill/>
+                    </a:ln>
+                    <a:effectLst>
+                      <a:outerShdw blurRad="190500" algn="tl" rotWithShape="0">
+                        <a:srgbClr val="000000">
+                          <a:alpha val="70000"/>
+                        </a:srgbClr>
+                      </a:outerShdw>
+                    </a:effectLst>
+                  </pic:spPr>
+                </pic:pic>
+              </a:graphicData>
+            </a:graphic>
+          </wp:anchor>
+        </w:drawing>
+      </w:r>
+      <w:r>
+        <w:t>Vérifier les informations. Si besoin, vous pouvez directement modifier la demande depuis l’espace de modification.</w:t>
+      </w:r>
+      <w:r>
+        <w:rPr>
+          <w:noProof/>
+        </w:rPr>
+        <w:t xml:space="preserve"> </w:t>
+      </w:r>
+    </w:p>
+    <w:p>
+      <w:pPr>
+        <w:pStyle w:val="Paragraphedeliste"/>
+        <w:numPr>
+          <w:ilvl w:val="0"/>
+          <w:numId w:val="15"/>
+        </w:numPr>
+        <w:jc w:val="both"/>
+      </w:pPr>
+      <w:r>
+        <w:rPr>
+          <w:noProof/>
+        </w:rPr>
+        <w:drawing>
+          <wp:anchor distT="0" distB="0" distL="114300" distR="114300" simplePos="0" relativeHeight="251688960" behindDoc="0" locked="0" layoutInCell="1" allowOverlap="1" wp14:anchorId="11FD4D2C" wp14:editId="640A4248">
+            <wp:simplePos x="0" y="0"/>
+            <wp:positionH relativeFrom="margin">
+              <wp:posOffset>114300</wp:posOffset>
             </wp:positionH>
             <wp:positionV relativeFrom="margin">
-              <wp:posOffset>2016125</wp:posOffset>
+              <wp:posOffset>7094220</wp:posOffset>
+            </wp:positionV>
+            <wp:extent cx="5760720" cy="1259205"/>
+            <wp:effectExtent l="190500" t="190500" r="182880" b="188595"/>
+            <wp:wrapSquare wrapText="bothSides"/>
+            <wp:docPr id="1513941369" name="Image 1"/>
+            <wp:cNvGraphicFramePr>
+              <a:graphicFrameLocks xmlns:a="http://schemas.openxmlformats.org/drawingml/2006/main" noChangeAspect="1"/>
+            </wp:cNvGraphicFramePr>
+            <a:graphic xmlns:a="http://schemas.openxmlformats.org/drawingml/2006/main">
+              <a:graphicData uri="http://schemas.openxmlformats.org/drawingml/2006/picture">
+                <pic:pic xmlns:pic="http://schemas.openxmlformats.org/drawingml/2006/picture">
+                  <pic:nvPicPr>
+                    <pic:cNvPr id="1513941369" name=""/>
+                    <pic:cNvPicPr/>
+                  </pic:nvPicPr>
+                  <pic:blipFill>
+                    <a:blip r:embed="rId29" cstate="print">
+                      <a:extLst>
+                        <a:ext uri="{28A0092B-C50C-407E-A947-70E740481C1C}">
+                          <a14:useLocalDpi xmlns:a14="http://schemas.microsoft.com/office/drawing/2010/main" val="0"/>
+                        </a:ext>
+                      </a:extLst>
+                    </a:blip>
+                    <a:stretch>
+                      <a:fillRect/>
+                    </a:stretch>
+                  </pic:blipFill>
+                  <pic:spPr>
+                    <a:xfrm>
+                      <a:off x="0" y="0"/>
+                      <a:ext cx="5760720" cy="1259205"/>
+                    </a:xfrm>
+                    <a:prstGeom prst="rect">
+                      <a:avLst/>
+                    </a:prstGeom>
+                    <a:ln>
+                      <a:noFill/>
+                    </a:ln>
+                    <a:effectLst>
+                      <a:outerShdw blurRad="190500" algn="tl" rotWithShape="0">
+                        <a:srgbClr val="000000">
+                          <a:alpha val="70000"/>
+                        </a:srgbClr>
+                      </a:outerShdw>
+                    </a:effectLst>
+                  </pic:spPr>
+                </pic:pic>
+              </a:graphicData>
+            </a:graphic>
+          </wp:anchor>
+        </w:drawing>
+      </w:r>
+      <w:r>
+        <w:t>Une fois les modifications réalisées, ajouter un commentaire et cliquer sur « enregistrer les modifications ».</w:t>
+      </w:r>
+      <w:r>
+        <w:rPr>
+          <w:noProof/>
+        </w:rPr>
+        <w:t xml:space="preserve"> </w:t>
+      </w:r>
+    </w:p>
+    <w:p>
+      <w:r>
+        <w:br w:type="page"/>
+      </w:r>
+    </w:p>
+    <w:p>
+      <w:pPr>
+        <w:pStyle w:val="Paragraphedeliste"/>
+        <w:numPr>
+          <w:ilvl w:val="0"/>
+          <w:numId w:val="15"/>
+        </w:numPr>
+      </w:pPr>
+      <w:r>
+        <w:lastRenderedPageBreak/>
+        <w:t>Cliquer sur valider la demande (en bas de page)</w:t>
+      </w:r>
+      <w:r>
+        <w:rPr>
+          <w:noProof/>
+        </w:rPr>
+        <w:t>.</w:t>
+      </w:r>
+    </w:p>
+    <w:p>
+      <w:pPr>
+        <w:pStyle w:val="Paragraphedeliste"/>
+      </w:pPr>
+      <w:r>
+        <w:rPr>
+          <w:noProof/>
+        </w:rPr>
+        <w:drawing>
+          <wp:anchor distT="0" distB="0" distL="114300" distR="114300" simplePos="0" relativeHeight="251678720" behindDoc="0" locked="0" layoutInCell="1" allowOverlap="1" wp14:anchorId="62970568" wp14:editId="6F54BC10">
+            <wp:simplePos x="0" y="0"/>
+            <wp:positionH relativeFrom="margin">
+              <wp:align>center</wp:align>
+            </wp:positionH>
+            <wp:positionV relativeFrom="margin">
+              <wp:posOffset>434975</wp:posOffset>
             </wp:positionV>
             <wp:extent cx="2087880" cy="1076960"/>
             <wp:effectExtent l="190500" t="190500" r="198120" b="199390"/>
@@ -5329,7 +5866,7 @@
                     <pic:cNvPicPr/>
                   </pic:nvPicPr>
                   <pic:blipFill>
-                    <a:blip r:embed="rId25">
+                    <a:blip r:embed="rId30">
                       <a:extLst>
                         <a:ext uri="{28A0092B-C50C-407E-A947-70E740481C1C}">
                           <a14:useLocalDpi xmlns:a14="http://schemas.microsoft.com/office/drawing/2010/main" val="0"/>
@@ -5404,6 +5941,9 @@
       <w:r>
         <w:t>Saisissez un commentaire (obligatoire)</w:t>
       </w:r>
+      <w:r>
+        <w:t>.</w:t>
+      </w:r>
     </w:p>
     <w:p>
       <w:pPr>
@@ -5416,6 +5956,9 @@
       <w:r>
         <w:t>Confirmer</w:t>
       </w:r>
+      <w:r>
+        <w:t>.</w:t>
+      </w:r>
     </w:p>
     <w:p>
       <w:pPr>
@@ -5441,6 +5984,9 @@
       <w:r>
         <w:t>Cliquer sur le bouton de refus</w:t>
       </w:r>
+      <w:r>
+        <w:t>.</w:t>
+      </w:r>
     </w:p>
     <w:p>
       <w:pPr>
@@ -5453,6 +5999,9 @@
       <w:r>
         <w:t>Saisissez un commentaire (obligatoire)</w:t>
       </w:r>
+      <w:r>
+        <w:t>.</w:t>
+      </w:r>
     </w:p>
     <w:p>
       <w:pPr>
@@ -5468,8 +6017,11 @@
       </w:r>
     </w:p>
     <w:p>
-      <w:r>
-        <w:t>Il est possible d’annuler la dernière action réalisée si besoin. Pour cela cliquer sur le bouton annuler la dernière décision et saisissez un commentaire avant de valider.</w:t>
+      <w:pPr>
+        <w:jc w:val="both"/>
+      </w:pPr>
+      <w:r>
+        <w:t>Il est possible d’annuler la dernière action réalisée si besoin. Pour cela, cliquez sur le bouton annuler la dernière décision et saisissez un commentaire avant de valider.</w:t>
       </w:r>
       <w:r>
         <w:br w:type="page"/>
@@ -5485,7 +6037,7 @@
       <w:pPr>
         <w:pStyle w:val="Titre2"/>
       </w:pPr>
-      <w:bookmarkStart w:id="16" w:name="_Toc229386163"/>
+      <w:bookmarkStart w:id="16" w:name="_Toc229581954"/>
       <w:r>
         <w:t>Cas particulier : Demande de fermeture :</w:t>
       </w:r>
@@ -5545,7 +6097,7 @@
                     <pic:cNvPicPr/>
                   </pic:nvPicPr>
                   <pic:blipFill>
-                    <a:blip r:embed="rId26">
+                    <a:blip r:embed="rId31">
                       <a:extLst>
                         <a:ext uri="{28A0092B-C50C-407E-A947-70E740481C1C}">
                           <a14:useLocalDpi xmlns:a14="http://schemas.microsoft.com/office/drawing/2010/main" val="0"/>
@@ -5621,7 +6173,7 @@
                     <pic:cNvPicPr/>
                   </pic:nvPicPr>
                   <pic:blipFill>
-                    <a:blip r:embed="rId27">
+                    <a:blip r:embed="rId32">
                       <a:extLst>
                         <a:ext uri="{28A0092B-C50C-407E-A947-70E740481C1C}">
                           <a14:useLocalDpi xmlns:a14="http://schemas.microsoft.com/office/drawing/2010/main" val="0"/>
@@ -5697,7 +6249,7 @@
       <w:pPr>
         <w:pStyle w:val="Titre2"/>
       </w:pPr>
-      <w:bookmarkStart w:id="17" w:name="_Toc229386164"/>
+      <w:bookmarkStart w:id="17" w:name="_Toc229581955"/>
       <w:r>
         <w:lastRenderedPageBreak/>
         <w:t>Guide administrateur :</w:t>
@@ -5769,7 +6321,7 @@
                     <pic:cNvPicPr/>
                   </pic:nvPicPr>
                   <pic:blipFill>
-                    <a:blip r:embed="rId28" cstate="print">
+                    <a:blip r:embed="rId33" cstate="print">
                       <a:extLst>
                         <a:ext uri="{28A0092B-C50C-407E-A947-70E740481C1C}">
                           <a14:useLocalDpi xmlns:a14="http://schemas.microsoft.com/office/drawing/2010/main" val="0"/>
@@ -5828,7 +6380,7 @@
           <w:u w:val="single"/>
         </w:rPr>
       </w:pPr>
-      <w:bookmarkStart w:id="18" w:name="_Toc229386165"/>
+      <w:bookmarkStart w:id="18" w:name="_Toc229581956"/>
       <w:r>
         <w:rPr>
           <w:u w:val="single"/>
@@ -5917,7 +6469,7 @@
                     <pic:cNvPicPr/>
                   </pic:nvPicPr>
                   <pic:blipFill>
-                    <a:blip r:embed="rId29">
+                    <a:blip r:embed="rId34">
                       <a:extLst>
                         <a:ext uri="{28A0092B-C50C-407E-A947-70E740481C1C}">
                           <a14:useLocalDpi xmlns:a14="http://schemas.microsoft.com/office/drawing/2010/main" val="0"/>
@@ -6000,7 +6552,7 @@
                     <pic:cNvPicPr/>
                   </pic:nvPicPr>
                   <pic:blipFill rotWithShape="1">
-                    <a:blip r:embed="rId30">
+                    <a:blip r:embed="rId35">
                       <a:extLst>
                         <a:ext uri="{28A0092B-C50C-407E-A947-70E740481C1C}">
                           <a14:useLocalDpi xmlns:a14="http://schemas.microsoft.com/office/drawing/2010/main" val="0"/>
@@ -6106,7 +6658,7 @@
                     <pic:cNvPicPr/>
                   </pic:nvPicPr>
                   <pic:blipFill>
-                    <a:blip r:embed="rId31">
+                    <a:blip r:embed="rId36">
                       <a:extLst>
                         <a:ext uri="{28A0092B-C50C-407E-A947-70E740481C1C}">
                           <a14:useLocalDpi xmlns:a14="http://schemas.microsoft.com/office/drawing/2010/main" val="0"/>
@@ -6224,7 +6776,7 @@
                     <pic:cNvPicPr/>
                   </pic:nvPicPr>
                   <pic:blipFill>
-                    <a:blip r:embed="rId32"/>
+                    <a:blip r:embed="rId37"/>
                     <a:stretch>
                       <a:fillRect/>
                     </a:stretch>
@@ -6329,7 +6881,7 @@
                     <pic:cNvPicPr/>
                   </pic:nvPicPr>
                   <pic:blipFill>
-                    <a:blip r:embed="rId33"/>
+                    <a:blip r:embed="rId38"/>
                     <a:stretch>
                       <a:fillRect/>
                     </a:stretch>
@@ -6372,7 +6924,7 @@
                     <pic:cNvPicPr/>
                   </pic:nvPicPr>
                   <pic:blipFill>
-                    <a:blip r:embed="rId34"/>
+                    <a:blip r:embed="rId39"/>
                     <a:stretch>
                       <a:fillRect/>
                     </a:stretch>
@@ -6452,7 +7004,7 @@
                     <pic:cNvPicPr/>
                   </pic:nvPicPr>
                   <pic:blipFill>
-                    <a:blip r:embed="rId35"/>
+                    <a:blip r:embed="rId40"/>
                     <a:stretch>
                       <a:fillRect/>
                     </a:stretch>
@@ -6548,7 +7100,7 @@
                     <pic:cNvPicPr/>
                   </pic:nvPicPr>
                   <pic:blipFill>
-                    <a:blip r:embed="rId36"/>
+                    <a:blip r:embed="rId41"/>
                     <a:stretch>
                       <a:fillRect/>
                     </a:stretch>
@@ -6583,7 +7135,7 @@
       <w:pPr>
         <w:pStyle w:val="Titre3"/>
       </w:pPr>
-      <w:bookmarkStart w:id="19" w:name="_Toc229386166"/>
+      <w:bookmarkStart w:id="19" w:name="_Toc229581957"/>
       <w:r>
         <w:t>Gérer les services :</w:t>
       </w:r>
@@ -6931,7 +7483,7 @@
       <w:pPr>
         <w:pStyle w:val="Titre3"/>
       </w:pPr>
-      <w:bookmarkStart w:id="20" w:name="_Toc229386167"/>
+      <w:bookmarkStart w:id="20" w:name="_Toc229581958"/>
       <w:r>
         <w:t>Gérer les logiciels :</w:t>
       </w:r>
@@ -7185,7 +7737,7 @@
                     <pic:cNvPicPr/>
                   </pic:nvPicPr>
                   <pic:blipFill>
-                    <a:blip r:embed="rId33"/>
+                    <a:blip r:embed="rId38"/>
                     <a:stretch>
                       <a:fillRect/>
                     </a:stretch>
@@ -7231,7 +7783,7 @@
                     <pic:cNvPicPr/>
                   </pic:nvPicPr>
                   <pic:blipFill>
-                    <a:blip r:embed="rId34"/>
+                    <a:blip r:embed="rId39"/>
                     <a:stretch>
                       <a:fillRect/>
                     </a:stretch>
@@ -7470,16 +8022,16 @@
           <w:noProof/>
         </w:rPr>
         <w:drawing>
-          <wp:anchor distT="0" distB="0" distL="114300" distR="114300" simplePos="0" relativeHeight="251685888" behindDoc="0" locked="0" layoutInCell="1" allowOverlap="1" wp14:anchorId="05664EA3" wp14:editId="6A007E49">
+          <wp:anchor distT="0" distB="0" distL="114300" distR="114300" simplePos="0" relativeHeight="251685888" behindDoc="0" locked="0" layoutInCell="1" allowOverlap="1" wp14:anchorId="05664EA3" wp14:editId="38B41295">
             <wp:simplePos x="0" y="0"/>
             <wp:positionH relativeFrom="margin">
               <wp:align>center</wp:align>
             </wp:positionH>
             <wp:positionV relativeFrom="page">
-              <wp:posOffset>9196705</wp:posOffset>
+              <wp:posOffset>9182100</wp:posOffset>
             </wp:positionV>
-            <wp:extent cx="6372860" cy="1314450"/>
-            <wp:effectExtent l="190500" t="190500" r="199390" b="190500"/>
+            <wp:extent cx="5867400" cy="1143000"/>
+            <wp:effectExtent l="190500" t="190500" r="190500" b="190500"/>
             <wp:wrapSquare wrapText="bothSides"/>
             <wp:docPr id="1160471782" name="Image 1"/>
             <wp:cNvGraphicFramePr>
@@ -7493,7 +8045,7 @@
                     <pic:cNvPicPr/>
                   </pic:nvPicPr>
                   <pic:blipFill rotWithShape="1">
-                    <a:blip r:embed="rId37">
+                    <a:blip r:embed="rId42">
                       <a:extLst>
                         <a:ext uri="{28A0092B-C50C-407E-A947-70E740481C1C}">
                           <a14:useLocalDpi xmlns:a14="http://schemas.microsoft.com/office/drawing/2010/main" val="0"/>
@@ -7508,7 +8060,7 @@
                   <pic:spPr bwMode="auto">
                     <a:xfrm>
                       <a:off x="0" y="0"/>
-                      <a:ext cx="6372860" cy="1314450"/>
+                      <a:ext cx="5867400" cy="1143000"/>
                     </a:xfrm>
                     <a:prstGeom prst="rect">
                       <a:avLst/>
@@ -7566,7 +8118,7 @@
       <w:pPr>
         <w:pStyle w:val="Titre2"/>
       </w:pPr>
-      <w:bookmarkStart w:id="21" w:name="_Toc229386168"/>
+      <w:bookmarkStart w:id="21" w:name="_Toc229581959"/>
       <w:r>
         <w:t>Notifications et relances automatiques :</w:t>
       </w:r>
@@ -7690,7 +8242,7 @@
       <w:pPr>
         <w:pStyle w:val="Titre2"/>
       </w:pPr>
-      <w:bookmarkStart w:id="22" w:name="_Toc229386169"/>
+      <w:bookmarkStart w:id="22" w:name="_Toc229581960"/>
       <w:r>
         <w:t>Que faire en cas de problème :</w:t>
       </w:r>
@@ -8161,6 +8713,12 @@
     <w:sectPr>
       <w:pgSz w:w="11906" w:h="16838"/>
       <w:pgMar w:top="1417" w:right="1417" w:bottom="1417" w:left="1417" w:header="708" w:footer="708" w:gutter="0"/>
+      <w:pgBorders w:offsetFrom="page">
+        <w:top w:val="single" w:sz="4" w:space="24" w:color="002060"/>
+        <w:left w:val="single" w:sz="4" w:space="24" w:color="002060"/>
+        <w:bottom w:val="single" w:sz="4" w:space="24" w:color="002060"/>
+        <w:right w:val="single" w:sz="4" w:space="24" w:color="002060"/>
+      </w:pgBorders>
       <w:pgNumType w:start="0"/>
       <w:cols w:space="708"/>
       <w:titlePg/>

</xml_diff>